<commit_message>
Proofread Spanish edition: 154 fixes applied, 13 decisions logged
Co-Authored-By: Claude Opus 5.5 <noreply@anthropic.com>
Claude-Session: https://claude.ai/code/session_015bGU9R5VguxHZDVriTWnnq
</commit_message>
<xml_diff>
--- a/corrected/Inn Trouble - ASSEMBLED - FORMATTED_Spanish.docx
+++ b/corrected/Inn Trouble - ASSEMBLED - FORMATTED_Spanish.docx
@@ -52,7 +52,7 @@
     <w:p/>
     <w:p>
       <w:r>
-        <w:t>La historia, todos los nombres, personajes y acontecimientos que se describen en esta obra son ficticios. No se pretende ni debe deducirse ninguna identificación avec personas reales (vivas o fallecidas), lugares, edificios ni productos.</w:t>
+        <w:t xml:space="preserve">La historia, todos los nombres, personajes y acontecimientos que se describen en esta obra son ficticios. No se pretende ni debe deducirse ninguna identificación con personas reales (vivas o fallecidas), lugares, edificios ni productos.</w:t>
       </w:r>
     </w:p>
     <w:p>
@@ -178,7 +178,7 @@
     </w:p>
     <w:p>
       <w:r>
-        <w:t>El Winter Wonderland Inn se alzaba allí donde la avenida Evergreen se ensanchaba hacia el parque, una casa alta de buhardillas pintada del suave verde grisáceo de un cielo de invierno, con un porche que rodeaba dos de sus lados como un brazo echado sobre los hombros de un amigo. Parecía haber crecido allí en lugar de haber sido construida. Fiona había colgado una corona en la puerta principal y me detuve al pie de los escalones para admirarla, como hacía cada vez que pasaba. Era un círculo grueso de perenne, denso y oscuro, atravesado por una ancha cinta dorada y tachonado de piñas que ella misma había dorado, con una sola ramita de agridulce que aportaba el naranja de la temporada.</w:t>
+        <w:t xml:space="preserve">El Winter Wonderland Inn se alzaba allí donde la avenida Evergreen se ensanchaba hacia el parque, una casa alta de buhardillas pintada del suave verde grisáceo de un cielo de invierno, con un porche que rodeaba dos de sus lados como un brazo echado sobre los hombros de un amigo. Parecía haber crecido allí en lugar de haber sido construida. Fiona había colgado una corona en la puerta principal y me detuve al pie de los escalones para admirarla, como hacía cada vez que pasaba. Era un círculo grueso de ramas de hoja perenne, denso y oscuro, atravesado por una ancha cinta dorada y tachonado de piñas que ella misma había dorado, con una sola ramita de agridulce que aportaba el naranja de la temporada.</w:t>
       </w:r>
     </w:p>
     <w:p>
@@ -198,7 +198,7 @@
     </w:p>
     <w:p>
       <w:r>
-        <w:t>El vestíbulo estaba cálido con la buena y profunda calidez de un fuego que llevaba encendido desde antes del amanecer. Olía a café y a humo de leña mezclados con el aroma más antiguo de la propia casa, cera de abejas y madera vieja. Los huéspedes se sentaban en los sillones bajos, una pareja junto a la ventana con un mapa desplegado entre ellos, una mujer mayor junto al fuego con una novela de bolsillo, y la estancia tenía el murmurro relajado de un lugar donde la gente se siente cómoda. Sin embargo, esta mañana había un olor nuevo debajo de todo aquello, penetrante y un poco metálico, que al principio no supe ubicar. Cuando miré a mi alrededor, lo comprendí. La forja de Sam Patel estaba por todas partes donde miraba. Había hecho los soportes de las lámparas a lo largo de las paredes, la alta pantalla contra incendios en la chimenea y una hilera de estrellas de hierro negro a lo largo de la repisa para el festival, y toda la estancia delantera había adquirido el tenue y limpio tufo de la fragua, integrado en el aire como el olor a pan en una cocina.</w:t>
+        <w:t xml:space="preserve">El vestíbulo estaba cálido con la buena y profunda calidez de un fuego que llevaba encendido desde antes del amanecer. Olía a café y a humo de leña mezclados con el aroma más antiguo de la propia casa, cera de abejas y madera vieja. Los huéspedes se sentaban en los sillones bajos, una pareja junto a la ventana con un mapa desplegado entre ellos, una mujer mayor junto al fuego con una novela de bolsillo, y la estancia tenía el murmullo relajado de un lugar donde la gente se siente cómoda. Sin embargo, esta mañana había un olor nuevo debajo de todo aquello, penetrante y un poco metálico, que al principio no supe ubicar. Cuando miré a mi alrededor, lo comprendí. La forja de Sam Patel estaba por todas partes donde miraba. Había hecho los soportes de las lámparas a lo largo de las paredes, la alta pantalla contra incendios en la chimenea y una hilera de estrellas de hierro negro a lo largo de la repisa para el festival, y toda la estancia delantera había adquirido el tenue y limpio tufo de la fragua, integrado en el aire como el olor a pan en una cocina.</w:t>
       </w:r>
     </w:p>
     <w:p>
@@ -208,7 +208,7 @@
     </w:p>
     <w:p>
       <w:r>
-        <w:t>Estaba de pie detrás del mostrador de recepción, dando vueltas a un bolígrafo de un lado para otro. Fiona era una mujer hecha para la alegría. Era regordeta y rápida, rápida al moverse y más rápida aún al reír, con una risa que nacía en lo más hondo y estallaba de golpe. La alegría se le había escapado como el calor de una habitación con la puerta abierta. Tenía ojeras bajo los ojos que los polvos no habían conseguido disimular. Su cárdigan estaba abrochado con un botón de más. Al verme, hizo lo que me turbó más que las sombras: compuso el rostro. Se puso la bienvenida a la fuerza, deliberadamente, como una mujer que se pone un abrigo que está demasiado cansada para llevar, y salió de detrás del mostrador hacia mí.</w:t>
+        <w:t xml:space="preserve">Estaba de pie detrás del mostrador de recepción, dando vueltas a un bolígrafo de un lado para otro. Fiona era una mujer hecha para la alegría. Era regordeta y rápida, rápida al moverse y más rápida aún al reír, con una risa que nacía en lo más hondo y estallaba de golpe. La alegría se le había escapado como el calor de una habitación con la puerta abierta. Tenía ojeras bajo los ojos que los polvos no habían conseguido disimular. Llevaba el cárdigan mal abrochado, desfasado en un botón. Al verme, hizo lo que me turbó más que las sombras: compuso el rostro. Se puso la bienvenida a la fuerza, deliberadamente, como una mujer que se pone un abrigo que está demasiado cansada para llevar, y salió de detrás del mostrador hacia mí.</w:t>
       </w:r>
     </w:p>
     <w:p>
@@ -218,7 +218,7 @@
     </w:p>
     <w:p>
       <w:r>
-        <w:t>—Siempre debo hacerlo —dije, y le tendí a cesta—. De manzana. Al borde de lo quemado, como te gusta. No discutas conmigo, la he traído a pie desde el principio de la avenida y Pip ha intentado comerse tu corona, así que me ha costado lo suyo.</w:t>
+        <w:t xml:space="preserve">—Siempre debo hacerlo —dije, y le tendí la cesta—. De manzana. Al borde de lo quemado, como te gusta. No discutas conmigo, la he traído a pie desde el principio de la avenida y Pip ha intentado comerse tu corona, así que me ha costado lo suyo.</w:t>
       </w:r>
     </w:p>
     <w:p>
@@ -313,7 +313,7 @@
     </w:p>
     <w:p>
       <w:r>
-        <w:t>—Un trabajo precioso, esa forja. —El desconocido era enjuto, de ojos brillantes y rondando los cincuenta y tantos, bien vestido con la elegancia ligeramente desaliñada de un hombre que viaja. Llevaba en la mano una pequeña libreta que ni se molestaba en ocultar. Miró a Sam de reojo—. ¿Herrero local? Siempre se nota lo que es local. Tiene seguridad. Y esta casa. —Se giró, sin prisas, para abarcar el vestíbulo, la escalera curva, el viejo medallón de yeso en el centro del techo—. Vaya, esta sí que es una casa con historia. Un negocio familiar, supongo. De generación en generación.</w:t>
+        <w:t xml:space="preserve">—Un trabajo precioso, esa forja. —El desconocido era enjuto, de ojos brillantes y rondando los cincuenta y tantos, bien vestido con la elegancia ligeramente desaliñada de un hombre que viaja. Llevaba en la mano una pequeña libreta que ni se molestaba en ocultar. Señaló con la cabeza hacia donde se había ido Sam—. ¿Herrero local? Siempre se nota lo que es local. Tiene seguridad. Y esta casa. —Se giró, sin prisas, para abarcar el vestíbulo, la escalera curva, el viejo medallón de yeso en el centro del techo—. Vaya, esta sí que es una casa con historia. Un negocio familiar, supongo. De generación en generación.</w:t>
       </w:r>
     </w:p>
     <w:p>
@@ -333,7 +333,7 @@
     </w:p>
     <w:p>
       <w:r>
-        <w:t>—Claus. —Sonrió, y era una buena sonrisa, fácil y ensayada, pero me fiaba de ella tanto como habría podido lanzar la pantalla contra incendios—. Entonces es usted la famosa señora Claus. Qué maravilla absoluta. Había oído hablar de ello, por supuesto, uno oye cosas, pero no terminé de creerlo hasta ahora. —Se inclinó una fracción, en plan confidencial—. Dígame. Las viejas familias de por aquí, los Blackburn y los demás, ¿todavía conservan sus cosas en el pueblo? ¿Antigüedades, muebles, joyas, ese tipo de cosas? Doy la casualidad de que estoy tras la pista de una pieza. Un broche.</w:t>
+        <w:t xml:space="preserve">—Claus. —Sonrió, y era una buena sonrisa, fácil y ensayada, pero no me fiaba de ella más de lo lejos que habría podido lanzar la pantalla contra incendios—. Entonces es usted la famosa señora Claus. Qué maravilla absoluta. Había oído hablar de ello, por supuesto, uno oye cosas, pero no terminé de creerlo hasta ahora. —Se inclinó una fracción, en plan confidencial—. Dígame. Las viejas familias de por aquí, los Blackburn y los demás, ¿todavía conservan sus cosas en el pueblo? ¿Antigüedades, muebles, joyas, ese tipo de cosas? Doy la casualidad de que estoy tras la pista de una pieza. Un broche.</w:t>
       </w:r>
     </w:p>
     <w:p>
@@ -373,7 +373,7 @@
     </w:p>
     <w:p>
       <w:r>
-        <w:t>Recogí a Pip, que entretanto se había abierto camino por el vestíbulo hasta una mesita junto a las escaleras y el gran centro de mesa brillante que había sobre ella, un cuenco de cristal tallado con fruta de vidrio que arrojaba arcoíris cuando el fuego lo alcanzaba. Estaba de pie con el pico a una pulgada de una pera de vidrio, vibrando ligeramente de deseo.</w:t>
+        <w:t xml:space="preserve">Recogí a Pip, que entretanto se había abierto camino por el vestíbulo hasta una mesita junto a las escaleras y el gran centro de mesa brillante que había sobre ella, un cuenco de cristal tallado con fruta de vidrio que arrojaba arcoíris cuando el fuego lo alcanzaba. Estaba de pie con el pico a dos o tres centímetros de una pera de vidrio, vibrando ligeramente de deseo.</w:t>
       </w:r>
     </w:p>
     <w:p>
@@ -461,7 +461,7 @@
     <w:p/>
     <w:p>
       <w:r>
-        <w:t>—¿Diga? —sostuve el auricular contra mi hombro, quitándome la harina de las manos con el delantal.</w:t>
+        <w:t xml:space="preserve">—¿Diga? —Sostuve el auricular contra mi hombro, quitándome la harina de las manos con el delantal.</w:t>
       </w:r>
     </w:p>
     <w:p/>
@@ -557,13 +557,13 @@
         <w:rPr>
           <w:i/>
         </w:rPr>
-        <w:t>Sé cómo consiguió tu familia esta posada. Sé lo que pasó con el broche que tu bisabuela le robó a los Blackburn, el que lleva el zafiro en el corazón, y la tienda de Ridgeline donde lo vendió para comprar este lugar. Paga, o todo el pueblo sabrá la verdad. Deja el dinero bajo los escalones de la entrada de la posada. Quita el lazo dorado de la corona y pon uno rojo en su lugar, para que sepa que el dinero está ahí.</w:t>
-      </w:r>
-    </w:p>
-    <w:p/>
-    <w:p>
-      <w:r>
-        <w:t>Lo leí dos veces. El reloj de pie hizo tic-tac. Algo en la redacción me enganchó. El zafiro en el corazón. Una forma extraña, suave, casi tierna para que un chantajista nombrara una piedra robada, como una frase arrancada de un libro. Lo dejé pasar. Tenía cosas mucho más importantes ante mí en ese momento que el giro lingüístico de un desconocido.</w:t>
+        <w:t xml:space="preserve">Sé cómo consiguió tu familia esta posada. Sé lo que pasó con el broche que tu bisabuela le robó a los Blackburn, el que lleva el zafiro en su corazón, y la tienda de Ridgeline donde lo vendió para comprar este lugar. Paga, o todo el pueblo sabrá la verdad. Deja el dinero bajo los escalones de la entrada de la posada. Quita el lazo dorado de la corona y pon uno rojo en su lugar, para que sepa que el dinero está ahí.</w:t>
+      </w:r>
+    </w:p>
+    <w:p/>
+    <w:p>
+      <w:r>
+        <w:t xml:space="preserve">Lo leí dos veces. El reloj de pie hizo tic-tac. Algo en la redacción me enganchó. El zafiro en su corazón. Una forma extraña, suave, casi tierna para que un chantajista nombrara una piedra robada, como una frase arrancada de un libro. Lo dejé pasar. Tenía cosas mucho más importantes ante mí en ese momento que el giro lingüístico de un desconocido.</w:t>
       </w:r>
     </w:p>
     <w:p/>
@@ -662,7 +662,7 @@
     <w:p/>
     <w:p>
       <w:r>
-        <w:t>—¿Pero es que no lo ves? —sacudió la cabeza con angustia—. No importa lo que sea verdad sobre mí. Solo importa lo que puedan decir. Si esto se sabe, lo arruina todo. El nombre de la posada. El nombre de mi familia. Cien años de trabajo, perdidos, por una chica a la que nunca conocí y algo que yo nunca hice. —Señaló la nota—. Y ahora alguien lo sabe. Alguien lo sabe, Jessica, y no entiendo cómo, porque tengo ese baúl cerrado con llave en el desván y soy la única persona viva que lo ha abierto jamás. La única. Entonces, ¿cómo?</w:t>
+        <w:t xml:space="preserve">—¿Pero es que no lo ves? —Sacudió la cabeza con angustia—. No importa lo que sea verdad sobre mí. Solo importa lo que puedan decir. Si esto se sabe, lo arruina todo. El nombre de la posada. El nombre de mi familia. Cien años de trabajo, perdidos, por una chica a la que nunca conocí y algo que yo nunca hice. —Señaló la nota—. Y ahora alguien lo sabe. Alguien lo sabe, Jessica, y no entiendo cómo, porque tengo ese baúl cerrado con llave en el desván y soy la única persona viva que lo ha abierto jamás. La única. Entonces, ¿cómo?</w:t>
       </w:r>
     </w:p>
     <w:p/>
@@ -680,7 +680,7 @@
     <w:p/>
     <w:p>
       <w:r>
-        <w:t>—Fiona —dije despacio, bajando la nota—. Léeotra vez. Menciona el zafiro. El zafiro en el corazón, esas exactas palabras. Y nombra Ridgeline, donde lo vendió. —Giré la fotografía hacia ella, acercando mi dedo al pálido brillo de la gema en el cuello de la mujer—. ¿Le has contado alguna vez a alguien esas dos cosas? ¿Que lo vendió en Ridgeline? ¿Que la piedra era un zafiro?</w:t>
+        <w:t xml:space="preserve">—Fiona —dije despacio, bajando la nota—. Léela otra vez. Menciona el zafiro. El zafiro en su corazón, esas exactas palabras. Y nombra Ridgeline, donde lo vendió. —Giré la fotografía hacia ella, acercando mi dedo al pálido brillo de la gema en el cuello de la mujer—. ¿Le has contado alguna vez a alguien esas dos cosas? ¿Que lo vendió en Ridgeline? ¿Que la piedra era un zafiro?</w:t>
       </w:r>
     </w:p>
     <w:p/>
@@ -782,7 +782,7 @@
     <w:p/>
     <w:p>
       <w:r>
-        <w:t>Pío y se puso a mi lado. Volvimos a casa a través del pueblo que despertaba, y mantuve la mano presionada sobre la nota durante todo el camino sin mirar hacia arriba, hacia las luces festivas de los aleros.</w:t>
+        <w:t xml:space="preserve">Pió y se puso a mi lado. Volvimos a casa a través del pueblo que despertaba, y mantuve la mano presionada sobre la nota durante todo el camino sin mirar hacia arriba, hacia las luces festivas de los aleros.</w:t>
       </w:r>
     </w:p>
     <w:p>
@@ -817,7 +817,7 @@
     </w:p>
     <w:p>
       <w:r>
-        <w:t>—Así que la cuestión no es quién odia a Fiona —dijo—. Porque nadie odia a Fiona. No encontrarías en este pueblo a un solo alma que hable mal de ella aunque ofrecieras una recompensa. La cuestión es quién ha leído los documentos de los Blackburn.</w:t>
+        <w:t xml:space="preserve">—Así que la cuestión no es quién odia a Fiona —dijo—. Porque nadie odia a Fiona. No encontrarías en este pueblo a una sola alma que hable mal de ella aunque ofrecieras una recompensa. La cuestión es quién ha leído los documentos de los Blackburn.</w:t>
       </w:r>
     </w:p>
     <w:p>
@@ -852,7 +852,7 @@
     </w:p>
     <w:p>
       <w:r>
-        <w:t>—Sé que es verdad —dije—. Eso es lo que hace que me siente tan frío por dentro.</w:t>
+        <w:t xml:space="preserve">—Sé que es verdad —dije—. Eso es lo que hace que se me quede tan frío por dentro.</w:t>
       </w:r>
     </w:p>
     <w:p>
@@ -862,12 +862,12 @@
     </w:p>
     <w:p>
       <w:r>
-        <w:t>Eso tenía sentido, y me tranquilizó más de lo que lo había hecho la sopa, porque convirtió la sospecha enfermiza y tambaleante hacia un amigo en una pregunta en la que podía trabajar. En algún lugar, alguien se había parado entre las cajas de los Blackburn, en silencio, y había leído lo que no le importaba, y había visto en ello la silueta de medio millón de dólares. Esa persona podría ser Theo. O podría no serlo. Tenía que averiguarlo con justicia.</w:t>
-      </w:r>
-    </w:p>
-    <w:p>
-      <w:r>
-        <w:t>—La exposición se inaugura mañana —dije—. La del archivo. Todos los documentos antiguos en exhibición, los mapas viejos, las cartas y las fotografías. Theo has estado viviendo en la Sociedad para dejarlo todo listo; Martha dice que hace días que no pasa por su casa. Y medio pueblo estará allí para la inauguración.</w:t>
+        <w:t xml:space="preserve">Eso tenía sentido, y me tranquilizó más de lo que lo había hecho la sopa, porque convirtió la sospecha enfermiza y tambaleante hacia un amigo en una pregunta en la que podía trabajar. En algún lugar, alguien se había parado entre las cajas de los Blackburn, en silencio, y había leído lo que no tenía por qué leer, y había visto en ello la silueta de medio millón de dólares. Esa persona podría ser Theo. O podría no serlo. Tenía que averiguarlo con justicia.</w:t>
+      </w:r>
+    </w:p>
+    <w:p>
+      <w:r>
+        <w:t xml:space="preserve">—La exposición se inaugura mañana —dije—. La del archivo. Todos los documentos antiguos en exhibición, los mapas viejos, las cartas y las fotografías. Theo ha estado viviendo en la Sociedad para dejarlo todo listo; Martha dice que hace días que no pasa por su casa. Y medio pueblo estará allí para la inauguración.</w:t>
       </w:r>
     </w:p>
     <w:p>
@@ -942,7 +942,7 @@
     </w:p>
     <w:p>
       <w:r>
-        <w:t>Él se acercó a pararse detrás de mí y apoyó la barbilla en la coronilla de mi cabeza, y nos quedamos contemplando juntos el pueblo bañado en ese brillo dorado. Le sentí respirar, de forma lenta y compasiva.</w:t>
+        <w:t xml:space="preserve">Él se acercó a pararse detrás de mí y apoyó la barbilla en la coronilla de mi cabeza, y nos quedamos contemplando juntos el pueblo bañado en ese brillo dorado. Le sentí respirar, de forma lenta y acompasada.</w:t>
       </w:r>
     </w:p>
     <w:p>
@@ -1046,7 +1046,7 @@
     <w:p/>
     <w:p>
       <w:r>
-        <w:t>Tenía una sonrisa para todos los que entraban, una sonrisa sincera, radiante, a veces agitando ambas manos, y le contaba a un hombre alto con parka algo sobre las escrituras que hacía que el hombre asintiera y se fuera retirando centímetro a centímetro. Pero entre cada saludo, en el medio segundo en que creía que nadie lo miraba, la sonrisa se le borraba de la cara como algo demasiado pesado de sostener, y lo que había debajo me detuvo en seco. Su piel tenía un tono grisáceo. Había manchas violáceas bajo sus ojos, tan hondas como hematomas. Llevaba la corbata anudada con un cuarto de vuelta de desviación y sus gafas tenían una huella dactilar empañada en un cristal que ya no le quedaba atención para notar, y mucho menos para limpiar. Se alisó la corbata mientras lo miraba. Se la volvió a alisar un momento después, con el mismo gesto, como si hubiera olvidado que acababa de hacerlo.</w:t>
+        <w:t xml:space="preserve">Tenía una sonrisa para todos los que entraban, una sonrisa sincera, radiante, a veces tendiendo ambas manos, y le contaba a un hombre alto con parka algo sobre las escrituras que hacía que el hombre asintiera y se fuera retirando centímetro a centímetro. Pero entre cada saludo, en el medio segundo en que creía que nadie lo miraba, la sonrisa se le borraba de la cara como algo demasiado pesado de sostener, y lo que había debajo me detuvo en seco. Su piel tenía un tono grisáceo. Había manchas violáceas bajo sus ojos, tan hondas como hematomas. Llevaba la corbata anudada con un cuarto de vuelta de desviación y sus gafas tenían una huella dactilar empañada en un cristal que ya no le quedaba atención para notar, y mucho menos para limpiar. Se alisó la corbata mientras lo miraba. Se la volvió a alisar un momento después, con el mismo gesto, como si hubiera olvidado que acababa de hacerlo.</w:t>
       </w:r>
     </w:p>
     <w:p/>
@@ -1130,7 +1130,7 @@
     <w:p/>
     <w:p>
       <w:r>
-        <w:t>—Siempre voy detrás de mi broche. Es mi trabajo. —Se enderezó y se metió la libreta bajo el brazo—. Un hombre se me acercó hace un rato en la mesa de sidra y me dijo que los Blackburn una vez poseyeron la mitad de Maple Street. ¿Sabía eso? A la gente le encanta contarle lo que poseían las familias ricas. Nunca saben contarle lo que las familias ricas les hicieron a las personas que trabajaban para ellas. Esa parte no llega a los documentos familiares. —Hizo un gesto afirmativo hacia el cristal—. Curioso, eso. Veinte cartas y ni una sola escrita por una criada.</w:t>
+        <w:t xml:space="preserve">—Siempre voy detrás de mi broche. Es mi trabajo. —Se enderezó y se metió la libreta bajo el brazo—. Un hombre se me acercó hace un rato en la mesa de sidra y me dijo que los Blackburn una vez poseyeron la mitad de Maple Street. ¿Sabía eso? A la gente le encanta contarle lo que poseían las familias ricas. Nunca saben contarle lo que las familias ricas les hicieron a las personas que trabajaban para ellas. Esa parte no llega a los documentos familiares. —Hizo un gesto afirmativo hacia el cristal—. Curioso, eso. Veinte años de cartas y ni una sola escrita por una criada.</w:t>
       </w:r>
     </w:p>
     <w:p/>
@@ -1190,7 +1190,7 @@
     <w:p/>
     <w:p>
       <w:r>
-        <w:t>Yo tenía motivos para fijarse. Había sostenido una hoja de ese exacto papel la mañana anterior, con una exigencia de medio millón de dólares escrita en él con una letra fingida y torpe.</w:t>
+        <w:t xml:space="preserve">Yo tenía motivos para fijarme. Había sostenido una hoja de ese exacto papel la mañana anterior, con una exigencia de medio millón de dólares escrita en él con una letra fingida y torpe.</w:t>
       </w:r>
     </w:p>
     <w:p/>
@@ -1220,7 +1220,7 @@
     <w:p/>
     <w:p>
       <w:r>
-        <w:t>Pero me lo guardé doblado en el bolsillo del abrigo de todos modos, junto a la nota. Me enderezé y volví a mirar la sala cálida y abarrotada por última vez. A Theo, agachado ahora junto a la mesa de sidra, contándole a un niño pequeño sobre la fundación del pueblo con todo su corazón cansado, con los ojos del niño muy abiertos. A Vera, junto al mostrador, cuadrando su caja de papeles un cuarto de pulgada más. A Neil Carter, junto al cristal, escribiendo algo en su libreta. Y a la pila de papelería crema junto al codo de Vera, atrapando la luz.</w:t>
+        <w:t xml:space="preserve">Pero me lo guardé doblado en el bolsillo del abrigo de todos modos, junto a la nota. Me enderecé y volví a mirar la sala cálida y abarrotada por última vez. A Theo, agachado ahora junto a la mesa de sidra, contándole a un niño pequeño sobre la fundación del pueblo con todo su corazón cansado, con los ojos del niño muy abiertos. A Vera, junto al mostrador, cuadrando su caja de papeles medio centímetro más. A Neil Carter, junto al cristal, escribiendo algo en su libreta. Y a la pila de papelería crema junto al codo de Vera, atrapando la luz.</w:t>
       </w:r>
     </w:p>
     <w:p/>
@@ -1243,7 +1243,7 @@
     <w:p/>
     <w:p>
       <w:r>
-        <w:t>Yarn Tales se encontraba en la esquina de Evergreen y Maple con el escaparate lleno de madejas ordenadas por colores como una caja de pinturas abierta. Por dentro era un sitio cálido y penumbroso. Olía a lana y a la manzanilla que Olivia siempre mantenía en infusión sobre la pequeña hornilla detrás del mostrador. Aquella tarde el corro había arrimado las sillas hacia la parte delantera, bajo la acuosa luz de octubre que entraba por la ventana, y estaban todas. Olivia ocupaba el centro, por supuesto, ya que era su tienda, su manzanilla y, de algún modo, siempre su conversación; Dot a su lado, robusta y gris, seca como una galleta; Claire con su rapidez de periodista, que ya llevaba tres hileras de ventaja a las demás; Ivy, que se reía de las cosas antes de que terminaran de tener gracia; Martha, erguida en la buena silla con los tobillos cruzados; y Ellie, la dulce Ellie, frunciendo el ceño ante un punto caído.</w:t>
+        <w:t xml:space="preserve">Yarn Tales se encontraba en la esquina de Evergreen y Maple con el escaparate lleno de madejas ordenadas por colores como una caja de pinturas abierta. Por dentro era un sitio cálido y penumbroso. Olía a lana y a la manzanilla que Olivia siempre mantenía en infusión sobre la pequeña hornilla detrás del mostrador. Aquella tarde el círculo había arrimado las sillas hacia la parte delantera, bajo la acuosa luz de octubre que entraba por la ventana, y estaban todas. Olivia ocupaba el centro, por supuesto, ya que era su tienda, su manzanilla y, de algún modo, siempre su conversación; Dot a su lado, robusta y gris, seca como una galleta; Claire con su rapidez de periodista, que ya llevaba tres hileras de ventaja a las demás; Ivy, que se reía de las cosas antes de que terminaran de tener gracia; Martha, erguida en la buena silla con los tobillos cruzados; y Ellie, la dulce Ellie, frunciendo el ceño ante un punto caído.</w:t>
       </w:r>
     </w:p>
     <w:p>
@@ -1318,7 +1318,7 @@
     </w:p>
     <w:p>
       <w:r>
-        <w:t>—No es la exposición. —Martha dejó las agujas en su regazo—. Es el dinero. La Sociedad está arruinada, Jessica. Arruinada de verdad. Me lo contó el propio Theo el año pasado, antes de dejar de reconocérselo a nadie. No tienen ningún fondo del que hablar. Nunca lo han tenido. Sobrevivían con una pequeña subvención del ayuntamiento y lo que recaudaban en la feria de verano, hasta que el ayuntamiento recortó la ayuda hace dos presupuestos. El tejado de las habitaciones traseras deja pasar el agua cada vez que llueve. La caldera es más vieja que yo. Y ha solicitado ayudas a todas las fundaciones y patronatos en tres estados. —Meneó la cabeza lentamente—. Rechazado. Rechazado. Rechazado. He visto llegar las cartas. Me enseñó una, una vez, y luego dejó de enseñármelas.</w:t>
+        <w:t xml:space="preserve">—No es la exposición. —Martha dejó las agujas en su regazo—. Es el dinero. La Sociedad está arruinada, Jessica. Arruinada de verdad. Me lo contó el propio Theo la primavera pasada, antes de dejar de reconocérselo a nadie. No tienen ningún fondo del que hablar. Nunca lo han tenido. Sobrevivían con una pequeña subvención del ayuntamiento y lo que recaudaban en la feria de verano, hasta que el ayuntamiento recortó la ayuda hace dos presupuestos. El tejado de las habitaciones traseras deja pasar el agua cada vez que llueve. La caldera es más vieja que yo. Y ha solicitado ayudas a todas las fundaciones y patronatos en tres estados. —Meneó la cabeza lentamente—. Rechazado. Rechazado. Rechazado. He visto llegar las cartas. Me enseñó una, una vez, y luego dejó de enseñármelas.</w:t>
       </w:r>
     </w:p>
     <w:p>
@@ -1348,7 +1348,7 @@
     </w:p>
     <w:p>
       <w:r>
-        <w:t>Sospechaba de él. Un hombre tan desesperado, que se había pasado las noches a solas entre las cajas de Blackburn, que se había plantado ante todo el pueblo para decir que las cartas más interesantes habían desaparecido. Quería estar segura y me obligué a esperar.</w:t>
+        <w:t xml:space="preserve">Sospechaba de él. Un hombre tan desesperado, que se había pasado las noches a solas entre las cajas de los Blackburn, que se había plantado ante todo el pueblo para decir que las cartas más interesantes habían desaparecido. Quería estar segura y me obligué a esperar.</w:t>
       </w:r>
     </w:p>
     <w:p>
@@ -1403,7 +1403,7 @@
     </w:p>
     <w:p>
       <w:r>
-        <w:t>La conversación cambió de rumbo después de aquello; pasaron a las manoplas, al nuevo bebé de la hija de Ivy y a si la nieve del primero de octubre presagiaba un invierno duro o benigno, algo que nadie zanjó. Dejé que la charla siguiera su curso. A mi lado, Martha había guardado silencio sobre su labor. Al cabo de un rato se inclinó un poco hacia mí y dijo en voz baja, solo para las dos:</w:t>
+        <w:t xml:space="preserve">La conversación cambió de rumbo después de aquello; pasaron a las manoplas, al nuevo bebé de la hija de Ivy y a si una primera nevada en octubre presagiaba un invierno duro o benigno, algo que nadie zanjó. Dejé que la charla siguiera su curso. A mi lado, Martha había guardado silencio sobre su labor. Al cabo de un rato se inclinó un poco hacia mí y dijo en voz baja, solo para las dos:</w:t>
       </w:r>
     </w:p>
     <w:p>
@@ -1453,7 +1453,7 @@
     </w:p>
     <w:p>
       <w:r>
-        <w:t xml:space="preserve">—No te estoy preguntando el qué —dijo—. Me lo contarás o no, y me da igual. Te estoy diciendo algo y quiero que lo escuches. Sea lo que sea lo que llevas a cuestas, no tienes que cargar con ello tú sola. De eso trata el círculo. No estamos aquí solo para tejer. Cualquiera puede tejer a solas. </w:t>
+        <w:t xml:space="preserve">—No te estoy preguntando el qué —dijo—. Me lo contarás o no, y las dos cosas están bien. Te estoy diciendo algo y quiero que lo escuches. Sea lo que sea lo que llevas a cuestas, no tienes que cargar con ello tú sola. De eso trata el círculo. No estamos aquí solo para tejer. Cualquiera puede tejer a solas. </w:t>
       </w:r>
     </w:p>
     <w:p>
@@ -1483,12 +1483,12 @@
     </w:p>
     <w:p>
       <w:r>
-        <w:t>Y volvió a su manoplas como si no acabara de entregarme nada en absoluto.</w:t>
-      </w:r>
-    </w:p>
-    <w:p>
-      <w:r>
-        <w:t>Cuando Pip y yo nos fuimos, una hora más tarde, la luz se había diluido hasta adoptar el color de un té clarito, y los hombres habían vuelto al prado para tender las últimas luces del festival entre los postes de la luz, llamándose los unos a los otros en medio del frío. Me detuve en la esquina y los observé un instante, mientras los nuevos hilos se tensaban en la oscuridad, y pensé en el dinero.</w:t>
+        <w:t xml:space="preserve">Y volvió a su manopla como si no acabara de entregarme nada en absoluto.</w:t>
+      </w:r>
+    </w:p>
+    <w:p>
+      <w:r>
+        <w:t xml:space="preserve">Cuando Pip y yo nos fuimos, una hora más tarde, la luz se había diluido hasta adoptar el color de un té clarito, y los hombres habían vuelto al prado para tender las últimas luces del festival entre los postes de la luz, llamándose los unos a los otros en medio del frío. Me detuve en la esquina y los observé un instante, mientras subían las nuevas tiras, todavía apagadas, y pensé en el dinero.</w:t>
       </w:r>
     </w:p>
     <w:p>
@@ -1519,12 +1519,12 @@
     </w:p>
     <w:p>
       <w:r>
-        <w:t>El parque era el lugar donde se celebraría la fiesta, la gran pradera comunal al sur de Evergreen que se extendía desde la plaza, con el monumento a los caídos cerca de la parte superior y el gran olmo en el extremo opuesto. Todo el pueblo había salido a arreglarlo. Había mesas de caballete para sacar y colocar en hileras, un escenario que montar en el norte y lo que parecían mil calabazas pequeñas para organizar de un modo que debiera parecer informal. De hecho, el comité se pasaría una hora dándoles vueltas. Yo solo había ido a dejarle al comité de festejos el primer par de docenas de manoplas del círculo, y a los noventa segundos de llegar, un hombre al que no conocía me había endosado una caja de calabazas para tarta y me había dicho: «¿Ponlas a lo largo del frente del escenario, por favor? Cuidado con la blanda». Así eran las cosas en este pueblo, y no me importaba en absoluto. No había nada en qué pensar con una caja de calabazas en los brazos, y eso me venía como anillo al dedo.</w:t>
-      </w:r>
-    </w:p>
-    <w:p>
-      <w:r>
-        <w:t>Las estaba colocando a lo largo del frente del escenario, de la más grande a la más pequeña, cuando una vocecita seria detrás de mí dijo: —Señora Claus, su pingüino se está comiendo una calabaza.</w:t>
+        <w:t xml:space="preserve">El parque era el lugar donde se celebraría la fiesta, la gran pradera comunal al sur de Evergreen que se extendía desde la plaza, con el monumento a los caídos cerca de la parte superior y el gran olmo en el extremo opuesto. Todo el pueblo había salido a arreglarlo. Había mesas de caballete para sacar y colocar en hileras, un escenario que montar en el norte y lo que parecían mil calabazas pequeñas para organizar de un modo que debiera parecer informal. De hecho, el comité se pasaría una hora dándoles vueltas. Yo solo había ido a dejarle al comité de festejos la primera docena de manoplas del círculo, y a los noventa segundos de llegar, un hombre al que no conocía me había endosado una caja de calabazas para tarta y me había dicho: «Ponlas a lo largo del frente del escenario, ¿quieres? Cuidado con la blanda». Así eran las cosas en este pueblo, y no me importaba en absoluto. No había nada en qué pensar con una caja de calabazas en los brazos, y eso me venía como anillo al dedo.</w:t>
+      </w:r>
+    </w:p>
+    <w:p>
+      <w:r>
+        <w:t xml:space="preserve">Las estaba colocando a lo largo del frente del escenario, de la más grande a la más pequeña, cuando una vocecita seria detrás de mí dijo: —Señora Claus, tu pingüino se está comiendo una calabaza.</w:t>
       </w:r>
     </w:p>
     <w:p>
@@ -1544,7 +1544,7 @@
     </w:p>
     <w:p>
       <w:r>
-        <w:t>Salió de ella brillante y sorprendida, una risa de verdad, de esas que se le escapan a un niño antes de que decida si dejarla salir o no, y me hizo más bien que una semana de sueño, porque había habido una larga temporada, tras la muerte de su madre, en la que Emma Redfern no reía. La enfermedad de Sarah Redfern se había prolongado durante casi un año y, después, Emma había deambulado por un pueblo que no sabía cómo acercarse a ella, un pequeño fantasma gris de niña. Había cogido el perrito de Martha a principios de este mes; lo había cogido, escondido y retenido a causa de un dolor demasiado grande para caber en una niña de ocho años. Todo el pueblo había salido a buscarla. Al final los había encontrado a los dos, la niña y el perro juntos en un cobertizo viejo, y el hallazgo había sido el principio del regreso de Emma a sí misma. Ahora paseaba al perro tres tardes por semana, un arreglo que Martha se había inventado de la nada para darle a una niña solitaria una razón para levantarse y un ser cálido del que responsabilizarse, y había funcionado, de rebote, sin que nadie dijera en voz alta para qué era.</w:t>
+        <w:t xml:space="preserve">Salió de ella brillante y sorprendida, una risa de verdad, de esas que se le escapan a un niño antes de que decida si dejarla salir o no, y me hizo más bien que una semana de sueño, porque había habido una larga temporada, tras la muerte de su madre, en la que Emma Redfern no reía. La enfermedad de Sarah Redfern se había prolongado durante casi un año y, después, Emma había deambulado por un pueblo que no sabía cómo acercarse a ella, un pequeño fantasma gris de niña. Había cogido el perrito de Martha a principios de este mes; lo había cogido, escondido y retenido a causa de un dolor demasiado grande para caber en una niña de ocho años. Todo el pueblo había salido a buscar. Al final los había encontrado a los dos, la niña y el perro juntos en un cobertizo viejo, y el hallazgo había sido el principio del regreso de Emma a sí misma. Ahora paseaba al perro tres tardes por semana, un arreglo que Martha se había inventado de la nada para darle a una niña solitaria una razón para levantarse y un ser cálido del que responsabilizarse, y había funcionado, de rebote, sin que nadie dijera en voz alta para qué era.</w:t>
       </w:r>
     </w:p>
     <w:p>
@@ -1599,7 +1599,7 @@
     </w:p>
     <w:p>
       <w:r>
-        <w:t>—Mejor. —Lo dijo con cautela, como un hombre que se adentra en un hielo del que aún no está seguro—. Estamos mejor. Ahora hay horas enteras en las que se me olvida, y luego me acuerdo, y recordarlo ya no me echa por los suelos. Simplemente camina a mi lado un rato y luego vuelve a aflojarse. —Dejó en el suelo el extremo del banco que llevaba—. Fue el pueblo el que hizo eso. No paro de intentar averiguar cómo darle las gracias a todo un pueblo y no hay manera de hacerlo. La gente simplemente no paraba de aparecer. Cacerolas. Alguien se llevaba a Emma una tarde. Martha y ese perro. Tú y ese pájaro ridículo. Nadie arregló nada. Nadie podía. Simplemente no paraban de aparecer hasta que aparecer se convirtió de nuevo en una vida, y un día miré a mi alrededor y estábamos viviendo en ella.</w:t>
+        <w:t xml:space="preserve">—Mejor. —Lo dijo con cautela, como un hombre que se adentra en un hielo del que aún no está seguro—. Estamos mejor. Ahora hay horas enteras en las que se me olvida, y luego me acuerdo, y recordarlo ya no me echa por los suelos. Simplemente camina a mi lado un rato y luego vuelve a aflojarse. —Dejó en el suelo el extremo del banco que llevaba—. Fue el pueblo el que hizo eso. No paro de intentar averiguar cómo darle las gracias a todo un pueblo y no hay manera de hacerlo. La gente simplemente no paraba de aparecer. Cazuelas. Alguien se llevaba a Emma una tarde. Martha y ese perro. Tú y ese pájaro ridículo. Nadie arregló nada. Nadie podía. Simplemente no paraban de aparecer hasta que aparecer se convirtió de nuevo en una vida, y un día miré a mi alrededor y estábamos viviendo en ella.</w:t>
       </w:r>
     </w:p>
     <w:p>
@@ -1624,7 +1624,7 @@
     </w:p>
     <w:p>
       <w:r>
-        <w:t>—Señora Claus. —Cogió las manoplas, las contó y apuntó la cifra—. Mesa de manualidades, al fondo. Gracias. Y sus renos no están en el programa de este año.</w:t>
+        <w:t xml:space="preserve">—Señora Claus. —Cogió las manoplas, las contó y apuntó la cifra—. Mesa de manualidades, al fondo. Gracias. Y tus renos no están en el programa de este año.</w:t>
       </w:r>
     </w:p>
     <w:p>
@@ -1634,7 +1634,7 @@
     </w:p>
     <w:p>
       <w:r>
-        <w:t>—Díselo a Bram. La semana pasada le puse una advertencia a Cometa en Maple Street y me dio las gracias por ello. —Una comisura de su boca se elevó—. Nadie me da las gracias por una advertencia.</w:t>
+        <w:t xml:space="preserve">—Díselo a Bram. La semana pasada le puse una advertencia a Comet en Maple Street y me dio las gracias por ello. —Una comisura de su boca se elevó—. Nadie me da las gracias por una advertencia.</w:t>
       </w:r>
     </w:p>
     <w:p>
@@ -1649,7 +1649,7 @@
     </w:p>
     <w:p>
       <w:r>
-        <w:t>Había vuelto al farolillo que Pip había destrozado, el que tenía la tapa arrancada y las semillas desparramadas por el costado sobre el césped frío. Se había quedado inmóvil ante él y luego había dicho, con una vocecilla cautelosa que no era de miedo: —Señora Claus. Mire.</w:t>
+        <w:t xml:space="preserve">Había vuelto al farolillo que Pip había destrozado, el que tenía la tapa arrancada y las semillas desparramadas por el costado sobre el césped frío. Se había quedado inmóvil ante él y luego había dicho, con una vocecilla cautelosa que no era de miedo: —Señora Claus. Mira.</w:t>
       </w:r>
     </w:p>
     <w:p>
@@ -1804,7 +1804,7 @@
     </w:p>
     <w:p>
       <w:r>
-        <w:t>Eso le arrancó una risa de verdad, esa profunda que llega de golpe, la risa que había estado echando de menos, y me hizo tanto bien oírla como la sopa le había hecho a ella. Volvimos a las sillas juntas. Yo contaba mientras ella arreglaba las cojas, y Pip supervisaba desde el cálido rincón de sol. Durante una hora, la posada volvió a ser simplemente una posada, cálida y ajetreada, preparándose para un festival. Pase lo que pase, esto valía la pena: la calidez que una chica asustada había creado de la nada y legado a lo largo de cien años a otra mujer que contaba sillas.</w:t>
+        <w:t xml:space="preserve">Eso le arrancó una risa de verdad, esa profunda que llega de golpe, la risa que había estado echando de menos, y me hizo tanto bien oírla como la sopa le había hecho a ella. Volvimos a las sillas juntas. Yo contaba mientras ella arreglaba las cojas, y Pip supervisaba desde el cálido rincón de sol. Durante una hora, la posada volvió a ser simplemente una posada, cálida y ajetreada, preparándose para un festival. Pasara lo que pasara, esto merecía protegerse: la calidez que una chica asustada había creado de la nada y legado a lo largo de cien años a otra mujer que contaba sillas.</w:t>
       </w:r>
     </w:p>
     <w:p>
@@ -1874,7 +1874,7 @@
     <w:p/>
     <w:p>
       <w:r>
-        <w:t>—Hizo la posada —dije, con naturalidad, dando vuelta el portavelas—. Toda esa rejería en el vestíbulo de Fiona. Las estrellas de la repisa, los apliques de las lámparas, la pantalla de la chimenea.</w:t>
+        <w:t xml:space="preserve">—Usted hizo los trabajos de la posada —dije, con naturalidad, dándole la vuelta al portavelas—. Toda esa rejería en el vestíbulo de Fiona. Las estrellas de la repisa, los apliques de las lámparas, la pantalla de la chimenea.</w:t>
       </w:r>
     </w:p>
     <w:p/>
@@ -1958,7 +1958,7 @@
     <w:p/>
     <w:p>
       <w:r>
-        <w:t>—Estas también son de ella —dijo, tomando una y girándola hacia la luz, y aún quedaba afecto en sus manos al sostenerla—. Los soportes del porche. Lo último del pedido. Puse bastante de mí mismo en ese vestíbulo este año, ya sabe. No se puede caminar por el salón de Fiona sin tocar algo que haya fabricado, o pararse cerca. —Dejó la estrella sobre la mesa—. Me viene bien. A un herrero le dejar un sitio impregnado del olor de su fuego.</w:t>
+        <w:t xml:space="preserve">—Estas también son de ella —dijo, tomando una y girándola hacia la luz, y aún quedaba afecto en sus manos al sostenerla—. Los soportes del porche. Lo último del pedido. Puse bastante de mí mismo en ese vestíbulo este año, ya sabe. No se puede caminar por el salón de Fiona sin tocar algo que haya fabricado, o pararse cerca. —Dejó la estrella sobre la mesa—. Me viene bien. A un herrero le gusta dejar un sitio impregnado del olor de su fuego.</w:t>
       </w:r>
     </w:p>
     <w:p/>
@@ -2089,7 +2089,7 @@
     <w:p/>
     <w:p>
       <w:r>
-        <w:t>Quienquiera que hubiera escrito esa nota trabajaba en la oscuridad. Todo su poder, hasta la última onza, provenía de no ser visto. Había escrito con una letra que no era la suya. Le había dicho a una mujer que colgara una cinta roja en su corona para no tener que mostrar nunca su cara al cobrar. Y allí, al otro lado de la mesa de una biblioteca en la sala más luminosa del pueblo, estaba Neil Carter, repartiendo tarjetas como un político en campaña, diciéndole a la bibliotecaria, al alcalde, a la señora Claus y a cualquiera que se estuviera quieto que iba tras un broche de los Blackburn que salió del pueblo por la puerta falsa en 1924.</w:t>
+        <w:t xml:space="preserve">Quienquiera que hubiera escrito esa nota trabajaba en la oscuridad. Todo su poder, hasta la última pizca, provenía de no ser visto. Había escrito con una letra que no era la suya. Le había dicho a una mujer que colgara una cinta roja en su corona para no tener que mostrar nunca su cara al cobrar. Y allí, al otro lado de la mesa de una biblioteca en la sala más luminosa del pueblo, estaba Neil Carter, repartiendo tarjetas como un político en campaña, diciéndole a la bibliotecaria, al alcalde, a la señora Claus y a cualquiera que se estuviera quieto que iba tras un broche de los Blackburn que salió del pueblo por la puerta falsa en 1924.</w:t>
       </w:r>
     </w:p>
     <w:p/>
@@ -2113,7 +2113,7 @@
     <w:p/>
     <w:p>
       <w:r>
-        <w:t>Lo sopesó con seriedad, cosa que le reconozco. No recurrió a la respuesta fácil. —Lo escribiría en mi informe —dijo al fin—. Adónde fue a parar la cosa y cómo. Cerrar el patrimonio. Cobrar mis honorarios y marcharme. —Se encogió de hombros—. No soy la ley, señora Claus, ni soy un sacerdote, y desde luego no soy la conciencia de una muchacha que ya habrá muerto hace mucho. Yo rastreo adónde fueron a parar las cosas. Lo que la gente hizo para que llegaran allí, y si hicieron bien o mal al hacerlo, eso es cosa suya y de lo que sea ante lo que respondan, y además es un asunto frío de hace cien años. No tengo ningún interés en avergonzar a una criada muerta por ser pobre. —Hizo una pausa y me miró un punto más fijamente por encima de las cajas—. ¿Por qué lo pregunta así? ¿Sabe algo que yo no sepa, señora Claus?</w:t>
+        <w:t xml:space="preserve">Lo sopesó con seriedad, cosa que le reconozco. No recurrió a la respuesta fácil. —Lo escribiría en mi informe —dijo al fin—. Adónde fue a parar la cosa y cómo. Cerrar la herencia. Cobrar mis honorarios y marcharme. —Se encogió de hombros—. No soy la ley, señora Claus, ni soy un sacerdote, y desde luego no soy la conciencia de una muchacha que ya habrá muerto hace mucho. Yo rastreo adónde fueron a parar las cosas. Lo que la gente hizo para que llegaran allí, y si hicieron bien o mal al hacerlo, eso es cosa suya y de lo que sea ante lo que respondan, y además es un asunto frío de hace cien años. No tengo ningún interés en avergonzar a una criada muerta por ser pobre. —Hizo una pausa y me miró un punto más fijamente por encima de las cajas—. ¿Por qué lo pregunta así? ¿Sabe algo que yo no sepa, señora Claus?</w:t>
       </w:r>
     </w:p>
     <w:p/>
@@ -2125,7 +2125,7 @@
     <w:p/>
     <w:p>
       <w:r>
-        <w:t>Se rió, una risa de verdad, y me dejó marchar. Cogí su tarjeta y reuní a Pip del lugar donde había estado investigando el estante inferior de la sección de historia local, y luego nos fuimos ambas a casa dando vueltas a la tarjeta una y otra vez entre mis dedos.</w:t>
+        <w:t xml:space="preserve">Se rio, una risa de verdad, y me dejó marchar. Cogí su tarjeta y reuní a Pip del lugar donde había estado investigando el estante inferior de la sección de historia local, y luego nos fuimos ambas a casa dando vueltas a la tarjeta una y otra vez entre mis dedos.</w:t>
       </w:r>
     </w:p>
     <w:p/>
@@ -2148,13 +2148,13 @@
     <w:p/>
     <w:p>
       <w:r>
-        <w:t>Volví a casa de la biblioteca y me encontré un reno en el jardín delantero comiéndose las últimas coles de Nick, y a un eludito muy alterado por el asunto.</w:t>
-      </w:r>
-    </w:p>
-    <w:p/>
-    <w:p>
-      <w:r>
-        <w:t>—¡Señora Claus! —Bram rodeó la esquina de la cabaña al trote, retorciéndose la gorra entre las manos—. Bram era el elfo que había bajado al sur con nosotros, el capataz del taller reubicado, devoto, quisquilloso y construido más o menos con la forma de una patata preocupada, y ahora estaba hecho un manojo de nervios—. Es Dancer. Se ha vuelto a escapar. La tercera vez esta semana, señora Claus, la tercera. Y juro por cada botón que tengo que ese cerrojo estaba echado cuando me fui, echado y comprobado, y ahora aquí la tienes comiéndose las buenas coles y no hay quien la mueva, y no me gusta nada de nada, se lo digo yo.</w:t>
+        <w:t xml:space="preserve">Volví a casa de la biblioteca y me encontré un reno en el jardín delantero comiéndose las últimas coles de Nick, y a un pequeño elfo muy alterado por el asunto.</w:t>
+      </w:r>
+    </w:p>
+    <w:p/>
+    <w:p>
+      <w:r>
+        <w:t xml:space="preserve">—¡Señora Claus! —Bram rodeó la esquina de la cabaña al trote, retorciéndose la gorra entre las manos—. Bram era el elfo que había bajado al sur con nosotros, el capataz del taller reubicado, devoto, quisquilloso y construido más o menos con la forma de una patata preocupada, y ahora estaba hecho un manojo de nervios—. Es Dancer. Se ha vuelto a escapar. La tercera vez esta semana, señora Claus, la tercera. Y juro por cada botón que tengo que ese cerrojo estaba echado cuando me fui, echado y comprobado, y ahora aquí la tiene comiéndose las buenas coles y no hay quien la mueva, y no me gusta nada de nada, se lo digo yo.</w:t>
       </w:r>
     </w:p>
     <w:p/>
@@ -2232,7 +2232,7 @@
     <w:p/>
     <w:p>
       <w:r>
-        <w:t>—Vino con nosotros —dijo—. La magia. Esa parte ya la sabes. Nunca fue del Polo, el Polo era solo el lugar donde residía. Un hogar que había pulido con el paso de mucho tiempo, un sitio donde estar. Y nos fuimos, y nos acompañó, porque es nuestra, o nosotros somos suyos, nunca he estado seguro de cómo va eso. Y aquí no tiene hogar. Ningún sitio desgastado donde instalarse. Así que echa chispas. —Hizo un gesto hacia el pueblo allá abajo, donde las luces del festival empezaban a encenderse en los tejados lejanos, doradas allí donde debieron ser anaranjadas—. Cosas pequeñas, sobre todo. Luces que cambian de color. Un cerrojo que se echa solo. Una calabaza que da acebo. No está haciendo ningún daño, Jess. No sabe hacer daño. Es como un perro que ha perdido a su dueño, yendo de puerta en puerta por toda la calle, con esperanza en cada una.</w:t>
+        <w:t xml:space="preserve">—Vino con nosotros —dijo—. La magia. Esa parte ya la sabes. Nunca fue del Polo, el Polo era solo el lugar donde residía. Un hogar que había pulido con el paso de mucho tiempo, un sitio donde estar. Y nos fuimos, y nos acompañó, porque es nuestra, o nosotros somos suyos, nunca he estado seguro de cómo va eso. Y aquí no tiene hogar. Ningún sitio desgastado donde instalarse. Así que echa chispas. —Hizo un gesto hacia el pueblo allá abajo, donde las luces del festival empezaban a encenderse en los tejados lejanos, doradas allí donde deberían haber sido anaranjadas—. Cosas pequeñas, sobre todo. Luces que cambian de color. Un cerrojo que se echa solo. Una calabaza que da acebo. No está haciendo ningún daño, Jess. No sabe hacer daño. Es como un perro que ha perdido a su dueño, yendo de puerta en puerta por toda la calle, con esperanza en cada una.</w:t>
       </w:r>
     </w:p>
     <w:p/>
@@ -2351,7 +2351,7 @@
     <w:p/>
     <w:p>
       <w:r>
-        <w:t>—Es una causa digna —dijo, cuando hube terminado—. Theo hace un buen trabajo, a su manera. Pero el presupuesto del pueblo es el presupuesto del pueblo, señora Claus, y la historia, perdone que se lo diga, no ara los campos en febrero ni mantiene encendidas las farolas. La Sociedad siempre se ha valido por sí misma. Estoy seguro de que saldrán a flote, siempre lo han hecho. —Dibujó una sonrisa, la sonrisa de un hombre que ha decidido que ha sido generoso con solo escuchar—. Quizá su festival resulte ser una excelente pequeña recaudación de fondos para ellos. La gente se pone muy sentimental en esta época del año.</w:t>
+        <w:t xml:space="preserve">—Es una causa digna —dijo, cuando hube terminado—. Theo hace un buen trabajo, a su manera. Pero el presupuesto del pueblo es el presupuesto del pueblo, señora Claus, y la historia, perdone que se lo diga, no quita la nieve de las carreteras en febrero ni mantiene encendidas las farolas. La Sociedad siempre se ha valido por sí misma. Estoy seguro de que saldrán a flote, siempre lo han hecho. —Dibujó una sonrisa, la sonrisa de un hombre que ha decidido que ha sido generoso con solo escuchar—. Quizá su festival resulte ser una excelente pequeña recaudación de fondos para ellos. La gente se pone muy sentimental en esta época del año.</w:t>
       </w:r>
     </w:p>
     <w:p/>
@@ -2375,7 +2375,7 @@
         <w:rPr>
           <w:i/>
         </w:rPr>
-        <w:t>DEEDS. PERMITS. TAX ROLLS. PROPERTY RECORDS, 1900–1950.</w:t>
+        <w:t xml:space="preserve">ESCRITURAS. LICENCIAS. PADRONES FISCALES. REGISTROS DE LA PROPIEDAD, 1900–1950.</w:t>
       </w:r>
       <w:r>
         <w:t xml:space="preserve"> Toda la memoria de papel sobre quién había poseído qué en Frost Falls, un siglo entero, a la espalda de aquella única mujer cansada, y las llaves de todo ello en el llavero de su cadera.</w:t>
@@ -2402,7 +2402,7 @@
     <w:p/>
     <w:p>
       <w:r>
-        <w:t>—La gente viene a mí para toda clase de cosas —dijo—. Sobre todo para quejarse de sus impuestos. Su pluma no dejó de moverse.</w:t>
+        <w:t xml:space="preserve">—La gente viene a mí para toda clase de cosas —dijo—. Sobre todo para quejarse de sus impuestos. —Su pluma no dejó de moverse.</w:t>
       </w:r>
     </w:p>
     <w:p/>
@@ -2497,7 +2497,7 @@
     <w:p/>
     <w:p>
       <w:r>
-        <w:t>La junta de la Sociedad Histórica se reunió aquel lunes por la tarde, en la fría trastienda bajo el tejado en ruinas. Claire me pidió que la acompañara, en parte porque la Gaceta quería una cara amiga en la sala y en parte, sospechaba yo, porque había adivinado más de lo que admitía sobre lo que yo llevaba encima, y quería que viera por mí misma cuán grave era la situación.</w:t>
+        <w:t xml:space="preserve">La junta de la Sociedad Histórica se reunió aquel lunes por la tarde, en la fría trastienda bajo el tejado en ruinas. Claire me pidió que la acompañara, en parte porque el Gazette quería una cara amiga en la sala y en parte, sospechaba yo, porque había adivinado más de lo que admitía sobre lo que yo llevaba encima, y quería que viera por mí misma cuán grave era la situación.</w:t>
       </w:r>
     </w:p>
     <w:p/>
@@ -2539,7 +2539,7 @@
     <w:p/>
     <w:p>
       <w:r>
-        <w:t>—Eso es lo que dicen las cuentas. —Theo se quitó las gafas y se presionó el puente de la nariz con los dedos, y por un instante la voz tan cuidada vaciló—. He solicitado ayudas en todas partes. Quiero que todos lo sepáis. Cada subvención, cada fundación, cada fondo en tres estados. Tengo una carpeta llena de negativas. Podría empapelar esta habitación con ellas, y al menos así la sala estaría seca. —Algunos de ellos rieron, la risa triste e impotente de la gente al límite de sus opciones—. El ayuntamiento no va a ayudar. Fui a ver al alcalde en persona la primavera pasada, y la señora Claus aquí presente volvió a ir esta mañana, y él dice lo mismo de siempre. La historia no abre los caminos con el arado. —Dejó las gafas sobre sus papeles—. No sé qué más intentar. He intentado ser razonable. He intentado dar lástima. No me avergüenza deciros que intenté dar lástima, por escrito, a una fundación en la ciudad, y me devolvieron una carta muy amable diciendo que no.</w:t>
+        <w:t xml:space="preserve">—Eso es lo que dicen las cuentas. —Theo se quitó las gafas y se presionó el puente de la nariz con los dedos, y por un instante la voz tan cuidada vaciló—. He solicitado ayudas en todas partes. Quiero que todos lo sepáis. Cada subvención, cada fundación, cada fondo en tres estados. Tengo una carpeta llena de negativas. Podría empapelar esta habitación con ellas, y al menos así la sala estaría seca. —Algunos de ellos rieron, la risa triste e impotente de la gente al límite de sus opciones—. El ayuntamiento no va a ayudar. Fui a ver al alcalde en persona la primavera pasada, y la señora Claus aquí presente volvió a ir esta mañana, y él dice lo mismo de siempre. La historia no quita la nieve de las carreteras. —Dejó las gafas sobre sus papeles—. No sé qué más intentar. He intentado ser razonable. He intentado dar lástima. No me avergüenza deciros que intenté dar lástima, por escrito, a una fundación en la ciudad, y me devolvieron una carta muy amable diciendo que no.</w:t>
       </w:r>
     </w:p>
     <w:p/>
@@ -2563,7 +2563,7 @@
     <w:p/>
     <w:p>
       <w:r>
-        <w:t>La junta dio vueltas en círculos durante una hora, proponiendo mercadillos benéficos y una campaña de cartas, cada idea más insignificante que el hueco que pretendía llenar. Toda la sala lo sabía y aun así decía cosas llenas de pequeñas esperanzas, porque no decir nada era peor. Al final votaron por mantener las puertas abiertas a través del año nuevo y «estudiar todas las opciones». Se levantaron y salieron al frío. La urna de café silbó y se apagó, y Theo se quedó atrás para guardar las sillas plegables él solo.</w:t>
+        <w:t xml:space="preserve">La junta dio vueltas en círculos durante una hora, proponiendo mercadillos benéficos y una campaña de cartas, cada idea más insignificante que el hueco que pretendía llenar. Toda la sala lo sabía y aun así decía cosas llenas de pequeñas esperanzas, porque no decir nada era peor. Al final votaron por mantener las puertas abiertas hasta pasado el año nuevo y «estudiar todas las opciones». Se levantaron y salieron al frío. La urna de café silbó y se apagó, y Theo se quedó atrás para guardar las sillas plegables él solo.</w:t>
       </w:r>
     </w:p>
     <w:p/>
@@ -2598,7 +2598,7 @@
     <w:p/>
     <w:p>
       <w:r>
-        <w:t>—¡Sra. Claus! ¡Y Pip! —Rodeó el mostrador y se agachó para saludar al pingüino, quien lo toleró con el aire de la realeza de visita—. Nunca pensé que lo diría, pero un pingüino es exactamente el socio que me faltaba. Hecho para el frío. Nadador nato. La gente no para de decirme que debería instalar una piscina, y yo no paro de decirles que no tengo espacio, pero por Pip encontraría el sitio.</w:t>
+        <w:t xml:space="preserve">—¡Señora Claus! ¡Y Pip! —Rodeó el mostrador y se agachó para saludar al pingüino, quien lo toleró con el aire de la realeza de visita—. Nunca pensé que lo diría, pero un pingüino es exactamente el socio que me faltaba. Hecho para el frío. Nadador nato. La gente no para de decirme que debería instalar una piscina, y yo no paro de decirles que no tengo espacio, pero por Pip encontraría el sitio.</w:t>
       </w:r>
     </w:p>
     <w:p/>
@@ -2610,7 +2610,7 @@
     <w:p/>
     <w:p>
       <w:r>
-        <w:t>Él rió y se incorporó. Ahí estaba, aquello que a medias esperaba no ver y a medias necesitaba. Bajo la sonrisa, estaba consumido hasta los huesos. Tenía las ojeras muy oscuras. La sonrisa misma se le torcía apenas un ápice en las comisuras, con el temblor de algo sostenido durante demasiado tiempo.</w:t>
+        <w:t xml:space="preserve">Él rio y se incorporó. Ahí estaba, aquello que a medias esperaba no ver y a medias necesitaba. Bajo la sonrisa, estaba consumido hasta los huesos. Tenía las ojeras muy oscuras. La sonrisa misma se le torcía apenas un ápice en las comisuras, con el temblor de algo sostenido durante demasiado tiempo.</w:t>
       </w:r>
     </w:p>
     <w:p/>
@@ -2640,7 +2640,7 @@
     <w:p/>
     <w:p>
       <w:r>
-        <w:t>—Lento —admitió—. El banco está sentado encima del préstamo. Ya van tres meses. Cada vez que creo que ya lo tenemos, quieren un formulario más, un número más, un mes más de extractos. —Apartó la mirada, contemplando el nuevo y luminoso suelo—. No le voy a mentir, Sra. Claus, es difícil. Puse todo en este lugar. Todo lo que tenía y buena parte de lo que no. Hay noches en que hago los números y luego me quedo ahí tendido sin dormir.</w:t>
+        <w:t xml:space="preserve">—Lento —admitió—. El banco está sentado encima del préstamo. Ya van tres meses. Cada vez que creo que ya lo tenemos, quieren un formulario más, un número más, un mes más de extractos. —Apartó la mirada, contemplando el nuevo y luminoso suelo—. No le voy a mentir, señora Claus, es difícil. Puse todo en este lugar. Todo lo que tenía y buena parte de lo que no. Hay noches en que hago los números y luego me quedo ahí tendido sin dormir.</w:t>
       </w:r>
     </w:p>
     <w:p/>
@@ -2652,7 +2652,7 @@
     <w:p/>
     <w:p>
       <w:r>
-        <w:t>—Lo es. —Soltó un largo suspiro y luego, debido a que su madre Aparentemente lo había criado para no quejarse sin un plan al que recurrir, enderezó los hombros—. Pero esto es lo que estoy haciendo al respecto, ya que pregunta, y prefiero decírselo directamente antes de que se preocupe. Acepté el contrato de seguridad del festival. Noches enteras, todo el fin de semana, vigilando los puestos, el escenario y el equipo para que nada desaparezca en la oscuridad. Y he añadido las clases tempranas, campamento de entrenamiento a las cinco y media, antes de que empiece el día normal. —Se encogió de hombros, y esta vez la sonrisa volvió con más sinceridad—. No se solucionan los problemas de dinero deseando que desaparezcan, Sra. Claus. Se solucionan trabajando más horas de las que dura el problema. Es el único método que conozco y nunca me ha fallado, solo que es lento y duele.</w:t>
+        <w:t xml:space="preserve">—Lo es. —Soltó un largo suspiro y luego, debido a que su madre aparentemente lo había criado para no quejarse sin un plan al que recurrir, enderezó los hombros—. Pero esto es lo que estoy haciendo al respecto, ya que pregunta, y prefiero decírselo directamente antes de que se preocupe. Acepté el contrato de seguridad del festival. Noches enteras, todo el fin de semana, vigilando los puestos, el escenario y el equipo para que nada desaparezca en la oscuridad. Y he añadido las clases tempranas, campamento de entrenamiento a las cinco y media, antes de que empiece el día normal. —Se encogió de hombros, y esta vez la sonrisa volvió con más sinceridad—. No se solucionan los problemas de dinero deseando que desaparezcan, señora Claus. Se solucionan trabajando más horas de las que dura el problema. Es el único método que conozco y nunca me ha fallado, solo que es lento y duele.</w:t>
       </w:r>
     </w:p>
     <w:p/>
@@ -2676,7 +2676,7 @@
     <w:p/>
     <w:p>
       <w:r>
-        <w:t>—¿Echarles un vistazo? —Rió, obligado a hacerlo por la sorpresa—. Sra. Claus, yo estaba cargando vitrinas de dos en dos y tratando de no meter el pie en una silla de hace cien años. No leí ni una sola palabra. No habría sabido distinguir a un Blackburn de una mora. Theo me entregaba una caja y decía con cuidado ahora, con cuidado, esa es preciosa, y yo llevaba la caja preciosa adonde él señalaba e iba derecho a buscar la siguiente caja preciosa. —Sacudió la cabeza, sonriendo ante el recuerdo—. Para el final de la semana estaba tan machacado que habría firmado lo que fuera solo con tal de que me dejaran sentarme. Esa fue toda mi carrera como historiador.</w:t>
+        <w:t xml:space="preserve">—¿Echarles un vistazo? —Rio, obligado a hacerlo por la sorpresa—. Señora Claus, yo estaba cargando vitrinas de dos en dos y tratando de no meter el pie en una silla de hace cien años. No leí ni una sola palabra. No habría sabido distinguir a un Blackburn de una mora. Theo me entregaba una caja y decía con cuidado ahora, con cuidado, esa es preciosa, y yo llevaba la caja preciosa adonde él señalaba e iba derecho a buscar la siguiente caja preciosa. —Sacudió la cabeza, sonriendo ante el recuerdo—. Para el final de la semana estaba tan machacado que habría firmado lo que fuera solo con tal de que me dejaran sentarme. Esa fue toda mi carrera como historiador.</w:t>
       </w:r>
     </w:p>
     <w:p/>
@@ -2741,7 +2741,7 @@
     <w:p/>
     <w:p>
       <w:r>
-        <w:t>Greta guardaba una gran bola de nieve de cristal en el mostrador de The Holly Jolly Bakery, un artículo turístico con un pequeño Frost Falls de cerámica dentro, verde, con el ayuntamiento y todo. Esa mañana, cuando pasé a comprar los rollos de canela de Nick, la nieve del interior no se asentaba. Daba vueltas y más vueltas sin que hubiera ninguna mano cerca, una pequeña ventisca girando sin parar detrás del cristal. Greta había echado un paño de cocina sobre la mitad de la bola, como si eso fuera a ayudar, y despachaba sus rollos al lado con la alegría resuelta de una mujer que había decidido no hablar de la bola de nieve.</w:t>
+        <w:t xml:space="preserve">Greta guardaba una gran bola de nieve de cristal en el mostrador de The Holly Jolly Bakery, un artículo turístico con un pequeño Frost Falls de cerámica dentro, con su prado, su ayuntamiento y todo. Esa mañana, cuando pasé a comprar los rollos de canela de Nick, la nieve del interior no se asentaba. Daba vueltas y más vueltas sin que hubiera ninguna mano cerca, una pequeña ventisca girando sin parar detrás del cristal. Greta había echado un paño de cocina sobre la mitad de la bola, como si eso fuera a ayudar, y despachaba sus rollos al lado con la alegría resuelta de una mujer que había decidido no hablar de la bola de nieve.</w:t>
       </w:r>
     </w:p>
     <w:p/>
@@ -2837,7 +2837,7 @@
     <w:p/>
     <w:p>
       <w:r>
-        <w:t>Bram, con hojas en las rodillas y doscientos años a las espaldas en un trabajo que jamás hasta entonces había implicado a un reno en una fuente, miró calle arriba tras ella, y su cara de papa gruñón se suavizó.</w:t>
+        <w:t xml:space="preserve">Bram, con hojas en las rodillas y doscientos años a las espaldas en un trabajo que jamás hasta entonces había implicado a un reno en una fuente, miró calle arriba tras ella, y su cara de patata gruñona se suavizó.</w:t>
       </w:r>
     </w:p>
     <w:p/>
@@ -2952,7 +2952,7 @@
     </w:p>
     <w:p>
       <w:r>
-        <w:t>—Es un tasador —dijo Dot—. O un estafador. Esos también son educados.</w:t>
+        <w:t xml:space="preserve">—Es un marchante —dijo Dot—. O un estafador. Esos también son educados.</w:t>
       </w:r>
     </w:p>
     <w:p>
@@ -3079,7 +3079,7 @@
     </w:p>
     <w:p>
       <w:r>
-        <w:t>—Empieza por los fáciles —dijo Nick, acomodándose frente a la mesa con su taza, soplando el vapor—. Házmelo en voz alta. Piensas mejor así y siempre lo has hecho, por mucho que le digas a la gente lo de tu gran mente silenciosa.</w:t>
+        <w:t xml:space="preserve">—Empieza por los fáciles —dijo Nick, acomodándose frente a la mesa con su taza, soplando el vapor—. Razónalo en voz alta. Piensas mejor así y siempre lo has hecho, por mucho que le digas a la gente lo de tu gran mente silenciosa.</w:t>
       </w:r>
     </w:p>
     <w:p>
@@ -3089,17 +3089,17 @@
     </w:p>
     <w:p>
       <w:r>
-        <w:t>—Jamal cargó con las cajas, pero nunca abrió ninguna —dije—. Me lo dijo él mismo, y le creo. Toda su beca de historia se basaba en «cuidado, que esto es valioso». Tuvo las manos sobre el exterior del secreto toda la semana y nunca miró dentro. Y el hombre tiene tres trabajos para salir de su hoyo de manera honrada, tanto el entrenamiento de las cinco y media como la seguridad nocturna. No es él. —Tracé una línea firme sobre el nombre de Jamal—. Tuvo la oportunidad, pero no el conocimiento. Y tampoco el corazón para algo así, lo cual me importa aunque no sirviera de nada en un tribunal.</w:t>
-      </w:r>
-    </w:p>
-    <w:p>
-      <w:r>
-        <w:t>—De acuerdo —Nick dio un trago—. ¿Sam?</w:t>
-      </w:r>
-    </w:p>
-    <w:p>
-      <w:r>
-        <w:t>—Sam no tuvo ninguna oportunidad. Jamás ha puesto un pie en el archivo; dice que el polvo le hace estornudar, y también le creo. Me dijo que las viejas familias son cosa de Theo, y hablaba en serio. —Golpecé la página con el dedo—. El olor a fragua lo metió en la lista, y creo que ese mismo olor a fragua va a ser exactamente lo que lo saque de ella, porque Pip me lleva diciendo desde la primera noche que la nota huele al lugar donde está el hierro de Sam, no a Sam. Y el hierro de Sam está presente por todo el vestíbulo de Fiona. Todo lo que se deja en ese vestíbulo sale oliendo a su fuego. Todo.</w:t>
+        <w:t xml:space="preserve">—Jamal cargó con las cajas, pero nunca abrió ninguna —dije—. Me lo dijo él mismo, y le creo. Toda su erudición histórica se basaba en «cuidado, que esto es valioso». Tuvo las manos sobre el exterior del secreto toda la semana y nunca miró dentro. Y el hombre tiene tres trabajos para salir de su hoyo de manera honrada, tanto el entrenamiento de las cinco y media como la seguridad nocturna. No es él. —Tracé una línea firme sobre el nombre de Jamal—. Tuvo la oportunidad, pero no el conocimiento. Y tampoco el corazón para algo así, lo cual me importa aunque no sirviera de nada en un tribunal.</w:t>
+      </w:r>
+    </w:p>
+    <w:p>
+      <w:r>
+        <w:t xml:space="preserve">—De acuerdo. —Nick dio un trago—. ¿Sam?</w:t>
+      </w:r>
+    </w:p>
+    <w:p>
+      <w:r>
+        <w:t xml:space="preserve">—Sam no tuvo ninguna oportunidad. Jamás ha puesto un pie en el archivo; dice que el polvo le hace estornudar, y también le creo. Me dijo que las viejas familias son cosa de Theo, y hablaba en serio. —Golpeé la página con el dedo—. El olor a fragua lo metió en la lista, y creo que ese mismo olor a fragua va a ser exactamente lo que lo saque de ella, porque Pip me lleva diciendo desde la primera noche que la nota huele al lugar donde está el hierro de Sam, no a Sam. Y el hierro de Sam está presente por todo el vestíbulo de Fiona. Todo lo que se deja en ese vestíbulo sale oliendo a su fuego. Todo.</w:t>
       </w:r>
     </w:p>
     <w:p>
@@ -3144,7 +3144,7 @@
     </w:p>
     <w:p>
       <w:r>
-        <w:t>—Quedan dos. —Miré la página y no quise hacerlo. Vera. Theo. Los dos nombres sobre los que no podía trazar ninguna línea—. Y esto es lo que me preocupa. De todos los que están en esta página, los únicos dos a los que no puedo exculpar son los que guardan las llaves de los viejos documentos del pueblo. Vera custodia las escrituras y los registros de propiedad, un siglo de quién poseía qué, y la escritura de la posada anda por ahí en algún sitio. Se puso rígida como una tabla y me dijo que jamás lee los papeles que tiene justo a sus espaldas. Y Theo. —Me obligué a decirlo despacio—. Theo vive en el archivo. Las cartas de los Blackburn estaban a su cuidado, en sus manos. Y las más interesantes, esas mismas que indicarían que un broche desapareció y a dónde fue, son de las que se levantó ante todo el pueblo para anunciar que se habían extraviado.</w:t>
+        <w:t xml:space="preserve">—Quedan dos. —Miré la página y no quise hacerlo. Vera. Theo. Los dos nombres sobre los que no podía trazar ninguna línea—. Y esto es lo que me preocupa. De todos los que están en esta página, los únicos dos a los que no puedo exculpar son los que guardan las llaves de los viejos documentos del pueblo. Vera custodia las escrituras y los registros de propiedad, un siglo de quién poseía qué, y la escritura de la posada anda por ahí en algún sitio. Se puso rígida como una tabla y me dijo que jamás lee los papeles que tiene justo a sus espaldas. Y Theo. —Me obligué a decirlo despacio—. Theo vive en el archivo. Las cartas de los Blackburn estaban a su cuidado, en sus manos. Y las más interesantes, esas mismas que indicarían que un broche desapareció y a dónde fue, son precisamente las que, plantado ante todo el pueblo, anunció que se habían extraviado.</w:t>
       </w:r>
     </w:p>
     <w:p>
@@ -3164,7 +3164,7 @@
     </w:p>
     <w:p>
       <w:r>
-        <w:t>—Pues compruébalo —dijo Nick—, en vez de sentarte aquí en la cocina a temerlo, lo cual nunca ha resuelto nada ni lo resolverá jamás. Ve a mirar lo único que aún no has examinado como debido. Las cartas en sí, o el lugar donde deberían estar. —Se estiró por encima de la mesa y puso su mano caliente sobre la mía, que estaba fría—. A Theo le vendría bien un par de manos para poner en orden ese archivo. Ve y ofréceselas. Y mientras ayudas, averigua una sola cosa. Si las palabras de esa nota coinciden con las palabras de las cartas que desaparecieron. Porque si lo hacen, Jess, entonces quienquiera que escribiera la nota no se limitó a leer los papeles de los Blackburn en general. Tenía esas cartas exactas en sus manos. Y hay una lista muy corta de personas en Frost Falls de las que se puede decir eso.</w:t>
+        <w:t xml:space="preserve">—Pues compruébalo —dijo Nick—, en vez de sentarte aquí en la cocina a temerlo, lo cual nunca ha resuelto nada ni lo resolverá jamás. Ve a mirar lo único que aún no has examinado como es debido. Las cartas en sí, o el lugar donde deberían estar. —Se estiró por encima de la mesa y puso su mano caliente sobre la mía, que estaba fría—. A Theo le vendría bien un par de manos para poner en orden ese archivo. Ve y ofréceselas. Y mientras ayudas, averigua una sola cosa. Si las palabras de esa nota coinciden con las palabras de las cartas que desaparecieron. Porque si lo hacen, Jess, entonces quienquiera que escribiera la nota no se limitó a leer los papeles de los Blackburn en general. Tenía esas cartas exactas en sus manos. Y hay una lista muy corta de personas en Frost Falls de las que se puede decir eso.</w:t>
       </w:r>
     </w:p>
     <w:p>
@@ -3174,7 +3174,7 @@
     </w:p>
     <w:p>
       <w:r>
-        <w:t>—Pronto —dije—. Hay dos cabos sueltos que atar primero. Sam y el forastero. Quiero a ambos fuera de duda, descartados por completo, antes de dejarme entrar en ese archivo y mirar fijamente a Theo. Le debo al menos eso, no señalarlo hasta que no quede nadie más a quien sospechar. Y entonces iré, y examinaré las cartas, y averiguaré si las palabras coinciden.</w:t>
+        <w:t xml:space="preserve">—Pronto —dije—. Hay dos cabos sueltos que atar primero. Sam y el forastero. Quiero a ambos fuera de duda, descartados por completo, antes de dejarme entrar en ese archivo y mirar fijamente a Theo. Le debo al menos eso, no señalarlo hasta que no quede nadie más de quien sospechar. Y entonces iré, y examinaré las cartas, y averiguaré si las palabras coinciden.</w:t>
       </w:r>
     </w:p>
     <w:p>
@@ -3230,7 +3230,7 @@
     </w:p>
     <w:p>
       <w:r>
-        <w:t>—Extorsión. —Pronunció la palabra en voz baja, como si le supiera mal—. Fiona. Y yo llevo tres semanas plantado en su porche hecho una furia por veinte dólares mientras ella ha estado cargando con eso. —Se apretó con fuerza el talón de una mano contra la frente, dejando una mancha oscura allí—. Dile que se lo perdono. Los veinte dólares, todo el encargo, cada centavo, dile que no quiero volver a saber nada de eso en lo que me queda de vida. Dios. Lo empeoré, ¿verdad? Acosándola por dinero mientras se ahogaba. Lo empeoré y ni me enteré.</w:t>
+        <w:t xml:space="preserve">—Extorsión. —Pronunció la palabra en voz baja, como si le dejara mal sabor de boca—. Fiona. Y yo llevo tres semanas plantado en su porche hecho una furia por veinte dólares mientras ella ha estado cargando con eso. —Se apretó con fuerza el talón de una mano contra la frente, dejando una mancha oscura allí—. Dile que se lo perdono. Los veinte dólares, todo el encargo, cada centavo, dile que no quiero volver a saber nada de eso en lo que me queda de vida. Dios. Lo empeoré, ¿verdad? Acosándola por dinero mientras se ahogaba. Lo empeoré y ni me enteré.</w:t>
       </w:r>
     </w:p>
     <w:p>
@@ -3270,7 +3270,7 @@
     </w:p>
     <w:p>
       <w:r>
-        <w:t>La lista era corta ahora. Solo quedaba un nombre que pudiera esperar limpiar, y pertenecía a un extraño.</w:t>
+        <w:t xml:space="preserve">La lista era corta ahora. Solo quedaba un nombre que pudiera esperar descartar, y pertenecía a un extraño.</w:t>
       </w:r>
     </w:p>
     <w:p>
@@ -3287,7 +3287,7 @@
     <w:p/>
     <w:p>
       <w:r>
-        <w:t>—Muy sólido —dijo, antes de que yo siquiera pudiera saludar—. Uno viejo, a dos estados de distancia, hace lo que dice tu hombre, sucesiones y herencias y rastreo de bienes perdidos para abogados a los que les sobra más dinero que tiempo. Y hay una sucesión Blackburn, Jessica, una de verdad, en curso. La última descendiente de la línea de Adelaide Blackburn murió abajo en la ciudad esta primavera, sin hijos, sin un testamento que valga la pena, y dejó un embrollo monumental. Nuestro alcalde es del bando de los primos, el bando que heredó la nariz y nada del dinero. Él no está metido en esto. Carter figura en los registros de la firma como el investigador que contrataron para desatar el ovillo. Lo supe por una empleada que me confirmó todo el asunto sin darse cuenta ni una sola vez de que estaba confirmando nada. Es exactamente, con precisión, lo que te dijo que era. Un fisgón con licencia y una cuenta de gastos.</w:t>
+        <w:t xml:space="preserve">—Es una firma de verdad —dijo, antes de que yo siquiera pudiera saludar—. Antigua, a dos estados de distancia, hace lo que dice tu hombre, sucesiones y herencias y rastreo de bienes perdidos para abogados a los que les sobra más dinero que tiempo. Y hay una sucesión Blackburn, Jessica, una de verdad, en curso. La última descendiente de la línea de Adelaide Blackburn murió abajo en la ciudad esta primavera, sin hijos, sin un testamento que valga la pena, y dejó un embrollo monumental. Nuestro alcalde es del bando de los primos, el bando que heredó la nariz y nada del dinero. Él no está metido en esto. Carter figura en los registros de la firma como el investigador que contrataron para desatar el ovillo. Lo supe por una empleada que me confirmó todo el asunto sin darse cuenta ni una sola vez de que estaba confirmando nada. Es exactamente, con precisión, lo que te dijo que era. Un fisgón con licencia y una cuenta de gastos.</w:t>
       </w:r>
     </w:p>
     <w:p/>
@@ -3335,7 +3335,7 @@
     <w:p/>
     <w:p>
       <w:r>
-        <w:t>—Medio millón. —Se reclinó y dejó escapar un silbido bajo—. Santo cielo. Alguien está exprimiendo a la descendiente. Por algo que la ley ni puede tocar. —Movía la cabeza despacio, y había asco en ello, asco auténtico—. Eso es cruel, señora Claus, y es estúpido. Ya no hay cargos que nadie pueda presentar por ese broche. La sucesión Blackburn no quiere el dinero de su amiga y desde luego no quiere su pellejo. Quiere una línea en un libro de contabilidad que diga adónde fue a parar la pieza, para que los abogados puedan cerrar el expediente y dejar de facturarse mutuamente. Quienquiera que esté sangrando a su amiga le está vendiendo un terror que ni siquiera es real. La vergüenza es la única arma que tiene. Ya no queda ningún caso legal, no después de cien años.</w:t>
+        <w:t xml:space="preserve">—Medio millón. —Se reclinó y dejó escapar un silbido bajo—. Santo cielo. Alguien está exprimiendo a la descendiente. Por algo que la ley ya no puede tocar. —Movía la cabeza despacio, y había asco en ello, asco auténtico—. Eso es cruel, señora Claus, y es estúpido. Ya no hay cargos que nadie pueda presentar por ese broche. La sucesión Blackburn no quiere el dinero de su amiga y desde luego no quiere su pellejo. Quiere una línea en un libro de contabilidad que diga adónde fue a parar la pieza, para que los abogados puedan cerrar el expediente y dejar de facturarse mutuamente. Quienquiera que esté sangrando a su amiga le está vendiendo un terror que ni siquiera es real. La vergüenza es la única arma que tiene. Ya no queda ningún caso legal, no después de cien años.</w:t>
       </w:r>
     </w:p>
     <w:p/>
@@ -3353,7 +3353,7 @@
     <w:p/>
     <w:p>
       <w:r>
-        <w:t>—Se lo dije el primer día. Yo rastreo adónde van las cosas. El resto es entre la gente y aquello ante lo que respondan. —Sacó una carpeta gorda de su pila y, tras un momento de reflexión, me la deslizó por encima de la mesa—. Aquí tiene. Bien puede quedarse con esto, ya que estamos siendo honestos el uno con el otro, y ya que algún ladronzuelo de su lindo pueblo está usando la peor mitad para torturar a una buena mujer. Es todo lo que he averiguado sobre la criada. Constance Okafor.</w:t>
+        <w:t xml:space="preserve">—Se lo dije el primer día. Yo rastreo adónde van las cosas. El resto es entre la gente y aquello ante lo que respondan. —Sacó una carpeta gorda de su pila y, tras un momento de reflexión, me la deslizó por encima de la mesa—. Aquí tiene. Bien puede quedarse con esto, ya que estamos siendo honestos el uno con el otro, y ya que algún ladronzuelo de su bonito pueblo está usando la peor mitad para torturar a una buena mujer. Es todo lo que he averiguado sobre la criada. Constance Okafor.</w:t>
       </w:r>
     </w:p>
     <w:p/>
@@ -3383,13 +3383,13 @@
     <w:p/>
     <w:p>
       <w:r>
-        <w:t>—Quédeselo. Tengo copias de cada página. —Hizo una pausa, y por una vez el brillo en él se quedó callado y suave—. Dígale algo a su amiga, de parte de un hombre que se gana la vida leyendo el correo de los muertos. Los secretos que arruinan a la gente son los a medias. Siempre. Es el ocultamiento lo que les afila los dientes, no la verdad. He desenterrado un centenar de secretos familiares sepultados en mi carrera, y todos y cada uno de ellos resultaron ser más pequeños y tristes de lo que la familia se había pasado la vida temiendo.</w:t>
-      </w:r>
-    </w:p>
-    <w:p/>
-    <w:p>
-      <w:r>
-        <w:t>Se lo agradecí, y se lo agradecí desde el fondo del alma. Recogí la carpeta y a mi pingüino, que se apartó de la lupa a regañadientes, y salí al frío con el último de mis falsos sospechosos relegado atrás. Había venido a la biblioteca a limpiar a Neil Carter. Lo había limpiado, y salí cargando con la cosa que algún día tal vez permitiría a Fiona caminar en libertad, pase lo que pase: la historia entera y verdadera de adónde había ido a parar el broche, y por qué.</w:t>
+        <w:t xml:space="preserve">—Quédeselo. Tengo copias de cada página. —Hizo una pausa, y por una vez el brillo en él se quedó callado y suave—. Dígale algo a su amiga, de parte de un hombre que se gana la vida leyendo el correo de los muertos. Los secretos que arruinan a la gente son los que se cuentan a medias. Siempre. Es el ocultamiento lo que les afila los dientes, no la verdad. He desenterrado un centenar de secretos familiares sepultados en mi carrera, y todos y cada uno de ellos resultaron ser más pequeños y tristes de lo que la familia se había pasado la vida temiendo.</w:t>
+      </w:r>
+    </w:p>
+    <w:p/>
+    <w:p>
+      <w:r>
+        <w:t xml:space="preserve">Se lo agradecí, y se lo agradecí desde el fondo del alma. Recogí la carpeta y a mi pingüino, que se apartó de la lupa a regañadientes, y salí al frío con el último de mis falsos sospechosos relegado atrás. Había venido a la biblioteca a descartar a Neil Carter. Lo había descartado, y salí cargando con la cosa que algún día tal vez permitiría a Fiona caminar en libertad, pasara lo que pasara: la historia entera y verdadera de adónde había ido a parar el broche, y por qué.</w:t>
       </w:r>
     </w:p>
     <w:p/>
@@ -3430,7 +3430,7 @@
         <w:rPr>
           <w:i/>
         </w:rPr>
-        <w:t>DESAPARECIDAS — volver a archivar al encontraras.</w:t>
+        <w:t xml:space="preserve">DESAPARECIDAS — volver a archivar al encontrarlas.</w:t>
       </w:r>
     </w:p>
     <w:p/>
@@ -3490,7 +3490,7 @@
     <w:p/>
     <w:p>
       <w:r>
-        <w:t>No lo confronté. No era el momento. Lo que se hace a las apuradas se hace mal, y aún quedaba la duda de cómo, exactamente, y de si lo había hecho solo. Así que terminé la hora. Le dije a Theo que la clasificación marchaba de maravilla, lo cual era verdad. Dejé que me apretara las manos en la puerta, que me diera las gracias y me dijera, con sus cansados ojos brillantes, que la exposición había traído cuarenta nuevos socios —cuarenta, si comprendía lo que eso podía significar para la Sociedad—. Dije que era maravilloso, y me refería a la maravilla de su esperanza aun cuando me rompía el corazón. Luego bajé los escalones hacia el frío con unas piernas que apenas me pertenecían.</w:t>
+        <w:t xml:space="preserve">No lo confronté. No era el momento. Lo que se hace deprisa y corriendo se hace mal, y aún quedaba la duda de cómo, exactamente, y de si lo había hecho solo. Así que terminé la hora. Le dije a Theo que la clasificación marchaba de maravilla, lo cual era verdad. Dejé que me apretara las manos en la puerta, que me diera las gracias y me dijera, con sus cansados ojos brillantes, que la exposición había traído cuarenta nuevos socios —cuarenta, si comprendía lo que eso podía significar para la Sociedad—. Dije que era maravilloso, y me refería a la maravilla de su esperanza aun cuando me rompía el corazón. Luego bajé los escalones hacia el frío con unas piernas que apenas me pertenecían.</w:t>
       </w:r>
     </w:p>
     <w:p/>
@@ -3502,7 +3502,7 @@
     <w:p/>
     <w:p>
       <w:r>
-        <w:t>Nick me echó un solo vistazo en la puerta y no preguntó nada. Me sentó, me puso una manta alrededor de los hombres y esperó. Al cabo de un rato se lo conté. La ficha. Las tres fichas marcadas con lápiz rojo. Las cinco palabras. La caligrafía de Theo. Escuchó, y su rostro se tornó triste y avejentado. Cuando terminé, no dijo lo siento, y no dijo si estaba segura, porque podía ver que lo estaba, y era un hombre demasiado bueno como para hacer que una persona dijera algo así dos veces.</w:t>
+        <w:t xml:space="preserve">Nick me echó un solo vistazo en la puerta y no preguntó nada. Me sentó, me puso una manta alrededor de los hombros y esperó. Al cabo de un rato se lo conté. La ficha. Las tres fichas marcadas con lápiz rojo. Las cinco palabras. La caligrafía de Theo. Escuchó, y su rostro se tornó triste y avejentado. Cuando terminé, no dijo lo siento, y no dijo si estaba segura, porque podía ver que lo estaba, y era un hombre demasiado bueno como para hacer que una persona dijera algo así dos veces.</w:t>
       </w:r>
     </w:p>
     <w:p/>
@@ -3514,7 +3514,7 @@
     <w:p/>
     <w:p>
       <w:r>
-        <w:t>—Sé que vino de él o a través de él —mi voz salió áspera—. Sé que quienquiera que haya escrito esa nota leyó las propias palabras de Theo sobre el broche. Y sé que hay una lista corta de gente que pudo hacerlo, y su nombre encabeza la lista, en lápiz rojo, con su propia letra. —Me ajusté más la manta—. No dejo de verlo en la puerta hace un momento. Cuarenta nuevos socios. Tan feliz. Nick, ¿cómo hace un hombre algo así? ¿Cómo le hace eso a Fiona en la oscuridad y les trae el cacao a los niños por la mañana y va en serio con ambas cosas, la misma semana, con las mismas manos?</w:t>
+        <w:t xml:space="preserve">—Sé que vino de él o a través de él —Mi voz salió áspera—. Sé que quienquiera que haya escrito esa nota leyó las propias palabras de Theo sobre el broche. Y sé que hay una lista corta de gente que pudo hacerlo, y su nombre encabeza la lista, en lápiz rojo, con su propia letra. —Me ajusté más la manta—. No dejo de verlo en la puerta hace un momento. Cuarenta nuevos socios. Tan feliz. Nick, ¿cómo hace un hombre algo así? ¿Cómo le hace eso a Fiona en la oscuridad y les trae el cacao a los niños por la mañana y va en serio con ambas cosas, la misma semana, con las mismas manos?</w:t>
       </w:r>
     </w:p>
     <w:p/>
@@ -3556,7 +3556,7 @@
     <w:p/>
     <w:p>
       <w:r>
-        <w:t>Tomé su mano, y salimos a través del frío y plateado patio con el brillo dorado derramándose con más fuerza a cada paso y Pip marchando en desgarbado tropel delante de nosotros. Nick apoyó la mano en la puerta del taller y la abrió.</w:t>
+        <w:t xml:space="preserve">Tomé su mano, y salimos a través del frío y plateado patio con el brillo dorado derramándose con más fuerza a cada paso y Pip anadeando delante de nosotros. Nick apoyó la mano en la puerta del taller y la abrió.</w:t>
       </w:r>
     </w:p>
     <w:p/>
@@ -3687,7 +3687,7 @@
     <w:p/>
     <w:p>
       <w:r>
-        <w:t>Tenía una expresión. Por lo visto, siempre la tengo. Y sí lo sabía, o lo bastante cerca como para que el casi no fuera más que una cuestión de cómo y de si estaba sola. Pero no estaba lista para decir su nombre en voz alta en esa pequeña sala. Decir el nombre de Theo Hussein en voz alta ante Fiona pondría en marcha algo rodando colina abajo que yo no podría volver a subir, y quería estar completamente segura, y segura de cómo hacerlo con delicadeza, antes de dejar que rodara.</w:t>
+        <w:t xml:space="preserve">Tenía una expresión. Por lo visto, siempre la tengo. Y sí lo sabía, o lo bastante cerca como para que el casi no fuera más que una cuestión de cómo y de si lo había hecho solo. Pero no estaba lista para decir su nombre en voz alta en esa pequeña sala. Decir el nombre de Theo Hussein en voz alta ante Fiona pondría en marcha algo rodando colina abajo que yo no podría volver a subir, y quería estar completamente segura, y segura de cómo hacerlo con delicadeza, antes de dejar que rodara.</w:t>
       </w:r>
     </w:p>
     <w:p/>
@@ -3779,7 +3779,7 @@
     <w:p/>
     <w:p>
       <w:r>
-        <w:t>El parque del pueblo se había transformado desde la mañana. Las mesas de caballete que habíamos sacado y arreglado con esmero rebosaban ahora con las ofrendas del pueblo: los pasteles de Greta, un centenar de frascos de conservas, los empanadillos de la esposa del señor Kim y una mesa entera con las manoplas del círculo colocadas en fila por tallas. El escenario del extremo norte tenía un grupo de música, uno de verdad, tres ancianos y una chica con un violín, tocando esa clase de música que hacía que hasta la gente que juraba que no bailaba marcara el compás con la bota sobre el suelo frío. Había farolillos colgados de los árboles desnudos. Los puestos de sidra y castañas asadas se extendían a lo largo de la plaza, y sobre todo ello brillaban las luces del festival. Ahora brillaban con luz dorada, cada una de las tiras, constante y cálida. Ni un solo alma hizo un comentario al respecto, porque todo el pueblo había decidido al unísono, sin mediar palabra, que las luces siempre habían sido doradas y punto.</w:t>
+        <w:t xml:space="preserve">El parque del pueblo se había transformado desde la mañana. Las mesas de caballete que habíamos sacado y arreglado con esmero rebosaban ahora con las ofrendas del pueblo: los pasteles de Greta, un centenar de frascos de conservas, las empanadillas de la esposa del señor Kim y una mesa entera con las manoplas del círculo colocadas en fila por tallas. El escenario del extremo norte tenía un grupo de música, uno de verdad, tres ancianos y una chica con un violín, tocando esa clase de música que hacía que hasta la gente que juraba que no bailaba marcara el compás con la bota sobre el suelo frío. Había farolillos colgados de los árboles desnudos. Los puestos de sidra y castañas asadas se extendían a lo largo de la plaza, y sobre todo ello brillaban las luces del festival. Ahora brillaban con luz dorada, cada una de las tiras, constante y cálida. Ni una sola alma hizo un comentario al respecto, porque todo el pueblo había decidido al unísono, sin mediar palabra, que las luces siempre habían sido doradas y punto.</w:t>
       </w:r>
     </w:p>
     <w:p/>
@@ -3797,13 +3797,13 @@
     <w:p/>
     <w:p>
       <w:r>
-        <w:t>Por un lado estaba allí, una lugareña en el festival de su pueblo, y era glorioso. Emma Redfern me encontró junto a la sidra y presumió de su disfraz, que había insistido en ponerse una noche antes: una constelación, Orión, de color negro con estrellas de plata cosidas en los lugares correctos por las manos cuidadosas de su padre, el cinturón exactamente perfecto. Me hizo nombrar cada estrella, y lo hice, porque conozco esas estrellas desde hace mucho tiempo. Le encantaba que la señora Claus conociera sus constelaciones. Mark estaba cerca con dos vasos de sidra y esa expresión de orgullo entrañable de un hombre que ve a su hija cumplir ocho años a viva voz entre la multitud. Martha me metió a la fuerza un par de manoplas del puesto, las verdes, «para esas manos frías tuyas». Sam Patel me saludó tocándose la gorra desde el otro extremo del parque, en su puesto cerca del porche de la posada, donde se había apostado todo el día con los ojos fijos en el mostrador de recepción justo al otro lado de la puerta, tal como le había pedido.</w:t>
-      </w:r>
-    </w:p>
-    <w:p/>
-    <w:p>
-      <w:r>
-        <w:t>Y por el otro lado, bajo toda esa calidez, yo también estaba vigilando. El segundo billete había dicho que el festival termina el domingo, y el chantajista estaba aquí, en alguna parte, entre esta multitud, con una de estas caras sonrientes. No podía dejar de mirar la puerta de la posada y el mostrador justo dentro, donde podría dejarse un tercer billete entre la multitud del festival.</w:t>
+        <w:t xml:space="preserve">Por un lado estaba allí, una lugareña en el festival de su pueblo, y era glorioso. Emma Redfern me encontró junto a la sidra y presumió de su disfraz, que había insistido en ponerse una noche antes: una constelación, Orión, de color negro con estrellas de plata cosidas en los lugares correctos por las manos cuidadosas de su padre, el cinturón exactamente perfecto. Me hizo nombrar cada estrella, y lo hice, porque conozco esas estrellas desde hace mucho tiempo. Le encantaba que la señora Claus conociera sus constelaciones. Mark estaba cerca con dos vasos de sidra y esa expresión de orgullo entrañable de un hombre que ve a su hija ser una niña de ocho años a viva voz entre la multitud. Martha me metió a la fuerza un par de manoplas del puesto, las verdes, «para esas manos frías tuyas». Sam Patel me saludó tocándose la gorra desde el otro extremo del parque, en su puesto cerca del porche de la posada, donde se había apostado todo el día con los ojos fijos en el mostrador de recepción justo al otro lado de la puerta, tal como le había pedido.</w:t>
+      </w:r>
+    </w:p>
+    <w:p/>
+    <w:p>
+      <w:r>
+        <w:t xml:space="preserve">Y por el otro lado, bajo toda esa calidez, yo también estaba vigilando. La segunda nota había dicho que el festival termina el domingo, y el chantajista estaba aquí, en alguna parte, entre esta multitud, con una de estas caras sonrientes. No podía dejar de mirar la puerta de la posada y el mostrador justo dentro, donde podría dejarse una tercera nota entre la multitud del festival.</w:t>
       </w:r>
     </w:p>
     <w:p/>
@@ -3839,7 +3839,7 @@
     <w:p/>
     <w:p>
       <w:r>
-        <w:t>Pensé en Fiona en su porche, sonriendo ante la fila para el puesto de fotos, y en el billete que le había llegado esa mañana, doblado en mi abrigo. No me correspondía a mí decirlo.</w:t>
+        <w:t xml:space="preserve">Pensé en Fiona en su porche, sonriendo ante la fila para el puesto de fotos, y en la nota que le había llegado esa mañana, doblado en mi abrigo. No me correspondía a mí decirlo.</w:t>
       </w:r>
     </w:p>
     <w:p/>
@@ -3869,7 +3869,7 @@
     <w:p/>
     <w:p>
       <w:r>
-        <w:t>Me quedé de pie bajo la nieve que caía entre mis vecinos, con Pip apoyada contra mi bota, la mano enguantada de Emma buscando la mía por un lado y la de Fiona por el otro. Lo miré todo: los farolillos, la nieve, la luz dorada, el centenar de rostros vueltos hacia el cielo, y comprendí, con esa certeza visceral que surge antes de que la cabeza logre asimilarlo, lo que estaba en juego exactamente. No era un edificio. Ni siquiera un secreto. Esto. Esta reunión, este pueblo siendo lo mejor de sí mismo en un día frío y brillante. Alguien había surgido de la oscuridad para extorsionar una parte de esto, para convertirlo en un arma y un miedo. Al estar allí de pie en la nieve, mi mente se volvió tan dura y despejada como el frío. Me costara lo que me costase, no iba a dejar que mantuviera su control sobre aquello. Lo sacaría a la luz, a un día como este, donde las cosas podían sanar.</w:t>
+        <w:t xml:space="preserve">Me quedé de pie bajo la nieve que caía entre mis vecinos, con Pip apoyada contra mi bota, la mano de Emma, enfundada en una manopla, buscando la mía por un lado y la de Fiona por el otro. Lo miré todo: los farolillos, la nieve, la luz dorada, el centenar de rostros vueltos hacia el cielo, y comprendí, con esa certeza visceral que surge antes de que la cabeza logre asimilarlo, lo que estaba en juego exactamente. No era un edificio. Ni siquiera un secreto. Esto. Esta reunión, este pueblo siendo lo mejor de sí mismo en un día frío y brillante. Alguien había surgido de la oscuridad para extorsionar una parte de esto, para convertirlo en un arma y un miedo. Al estar allí de pie en la nieve, mi mente se volvió tan dura y despejada como el frío. Me costara lo que me costase, no iba a dejar que mantuviera su control sobre aquello. Lo sacaría a la luz, a un día como este, donde las cosas podían sanar.</w:t>
       </w:r>
     </w:p>
     <w:p/>
@@ -3910,7 +3910,7 @@
     <w:p/>
     <w:p>
       <w:r>
-        <w:t>Había descartado a tres hombres, y al descartarlos me había quedado sola en una habitación pequeña con la verdad de la que me había estado sirviendo para evitarlos.</w:t>
+        <w:t xml:space="preserve">Había descartado a tres hombres, y al descartarlos me había quedado sola en una habitación pequeña con la verdad que había estado eludiendo sirviéndome de ellos.</w:t>
       </w:r>
     </w:p>
     <w:p>
@@ -3932,7 +3932,7 @@
         <w:t>&lt;/bt&gt;</w:t>
       </w:r>
       <w:r>
-        <w:t>: cinco palabras, la redacción de un historiador y no la de un ladrón, impresas en la nota de extorsión exactamente igual que en la tarjeta con la cuidadosa y ligera caligrafía de Theo. La nota estaba escrita en el papel de carta crema de la Sociedad, el pesado papel verjurado que había visto apilado en el mostrador de recepción de la exposición. El hombre que dirigía el archivo se estaba ahogando. Había golpeado en todas las puertas honestas de tres estados y las había visto cerrarse. Se había parado ante todo el pueblo para anunciar, con pesar, que las mismísimas cartas que describían el broche se habían extraviado.</w:t>
+        <w:t xml:space="preserve">: cinco palabras, la redacción de un historiador y no la de un ladrón, plasmadas en la nota de extorsión exactamente igual que en la ficha con la cuidadosa caligrafía inclinada de Theo. La nota estaba escrita en el papel de carta crema de la Sociedad, el pesado papel verjurado que había visto apilado en el mostrador de recepción de la exposición. El hombre que dirigía el archivo se estaba ahogando. Había golpeado en todas las puertas honestas de tres estados y las había visto cerrarse. Se había parado ante todo el pueblo para anunciar, con pesar, que las mismísimas cartas que describían el broche se habían extraviado.</w:t>
       </w:r>
     </w:p>
     <w:p>
@@ -3968,7 +3968,7 @@
         <w:rPr>
           <w:i/>
         </w:rPr>
-        <w:t>I know how your family came by this inn,</w:t>
+        <w:t xml:space="preserve">Sé cómo consiguió tu familia esta posada,</w:t>
       </w:r>
       <w:r>
         <w:t xml:space="preserve"> había dicho la primera nota. El robo en sí, el broche, la piedra, la casa de empeños de Ridgeline, todo estaba en las cartas de los Blackburn, en el archivo de Theo. Pero la compra de la posada, la adquisición de 1924, el rastro documental de una propiedad cambiando de manos, no aparecía en ninguna carta de los Blackburn. Eso era un registro de propiedad. Una escritura.</w:t>
@@ -3981,7 +3981,7 @@
     </w:p>
     <w:p>
       <w:r>
-        <w:t>Me quedé quieta bajo la luz de la lámpara. El robo del broche y la compra de la posada eran dos secretos diferentes, guardados en dos edificios diferentes. Theo tenía uno de ellos. Tenía el archivo, las cartas, la ficha de catálogo, el papel de carta. Tenía el robo. Pero la prueba de que el dinero robado se había convertido en esta querida posada estaba en el ayuntamiento, en los registros de propiedad que una mujer estirada y cansada me había mirado a los ojos y había jurado que jamás leía.</w:t>
+        <w:t xml:space="preserve">Me quedé quieta bajo la luz de la lámpara. El robo del broche y la compra de la posada eran dos secretos diferentes, guardados en dos edificios diferentes. Theo tenía uno de ellos. Tenía el archivo, las cartas, la ficha de catálogo, el papel de carta. Tenía la parte del robo. Pero la prueba de que el dinero robado se había convertido en esta querida posada estaba en el ayuntamiento, en los registros de propiedad que una mujer estirada y cansada me había mirado a los ojos y había jurado que jamás leía.</w:t>
       </w:r>
     </w:p>
     <w:p>
@@ -3996,7 +3996,7 @@
     </w:p>
     <w:p>
       <w:r>
-        <w:t xml:space="preserve">Subí a la cama con eso dando vueltas en mi interior, y por primera vez en días hubo algo bajo el miedo, un impulso frío y limpio. La forma había estado mal porque faltaba una pieza, y al acostarme allí en la oscuridad supe de quién era la pieza. Había visto a una mujer ponerse rígida al oír un nombre. Había visto los cajones de pie a su espalda. Y la había oído decirme, con la escritura de la </w:t>
+        <w:t xml:space="preserve">Subí a acostarme con eso dando vueltas en mi interior, y por primera vez en días hubo algo bajo el miedo, un impulso frío y limpio. La forma había estado mal porque faltaba una pieza, y al acostarme allí en la oscuridad supe de quién era la pieza. Había visto a una mujer ponerse rígida al oír un nombre. Había visto los cajones de pie a su espalda. Y la había oído decirme, con la escritura de la </w:t>
       </w:r>
       <w:r>
         <w:rPr>
@@ -4050,7 +4050,7 @@
         <w:rPr>
           <w:i/>
         </w:rPr>
-        <w:t>PROPERTY — EVERGREEN AVE — WINTER WONDERLAND INN</w:t>
+        <w:t xml:space="preserve">PROPIEDAD — AVDA. EVERGREEN — WINTER WONDERLAND INN</w:t>
       </w:r>
       <w:r>
         <w:t>.</w:t>
@@ -4065,7 +4065,7 @@
     <w:p/>
     <w:p>
       <w:r>
-        <w:t>Había leído este. Lo había sacado. La escritura de la posada, el papel que registraba la compra de 1924, la mitad del secreto que no estaba en ninguna carta de Blackburn y que nunca había estado. Había estado en las manos de Vera Reed, lo suficientemente reciente como para no haberlo guardado.</w:t>
+        <w:t xml:space="preserve">Había leído este. Lo había sacado. La escritura de la posada, el papel que registraba la compra de 1924, la mitad del secreto que no estaba en ninguna carta de Blackburn y que nunca había estado. Había estado en las manos de Vera Reed, tan recientemente que aún no lo había guardado.</w:t>
       </w:r>
     </w:p>
     <w:p/>
@@ -4095,7 +4095,7 @@
     <w:p/>
     <w:p>
       <w:r>
-        <w:t>Sus ojos se habían vuelto brillantes y no conseguía levantarlos para encontrarse con los míos, ni más ni menos que cada vez que se hablaba en voz alta de la vieja historia. Comprendí, de pie allí con mi abrigo y con la escritura de la zona verde en el bolso, que Vera Reed no era ninguna villana. Era una mujer asustada a la que un hombre al que respetaba, o compadecía, o ambas cosas, había arrastrado a algo, y ahora estaba demasiado metida para salir. Lo sabía, y no dormía mejor que la mujer a la que estaba ayudando a destruir.</w:t>
+        <w:t xml:space="preserve">Sus ojos se habían vuelto brillantes y no conseguía levantarlos para encontrarse con los míos, ni más ni menos que cada vez que se hablaba en voz alta de la vieja historia. Comprendí, de pie allí con mi abrigo y con la escritura de la zona verde en el bolso, que Vera Reed no era ninguna villana. Era una mujer asustada a la que un hombre en quien confiaba, o compadecía, o ambas cosas, había arrastrado a algo, y ahora estaba demasiado metida para salir. Lo sabía, y no dormía mejor que la mujer a la que estaba ayudando a destruir.</w:t>
       </w:r>
     </w:p>
     <w:p/>
@@ -4107,7 +4107,7 @@
     <w:p/>
     <w:p>
       <w:r>
-        <w:t>Theo tenía el robo. Lo había encontrado en las cartas de Blackburn: el broche, la piedra, la casa de empeños. Lo había catalogado con su pulcra letra, el zafiro en su corazón, y luego había sacado esas cartas de los archivos y las había dado por desaparecidas. Pero Theo, hundiéndose, vigilado por todo el pueblo, sin pisar nunca su casa, no podría haber hecho el resto. No podría haber confirmado que la posada se había comprado con el dinero, porque esa prueba no estaba en su edificio. Y no podría haber llevado las notas a través del pueblo y haber dejado una en un escritorio abarrotado a plena luz del día de festival, porque Theo Hussein no podía caminar por Evergreen Avenue desapercibido ni para salvar su vida.</w:t>
+        <w:t xml:space="preserve">Theo tenía la parte del robo. Lo había encontrado en las cartas de Blackburn: el broche, la piedra, la casa de empeños. Lo había catalogado con su pulcra letra, el zafiro en su corazón, y luego había sacado esas cartas de los archivos y las había dado por desaparecidas. Pero Theo, hundiéndose, vigilado por todo el pueblo, sin pisar nunca su casa, no podría haber hecho el resto. No podría haber confirmado que la posada se había comprado con el dinero, porque esa prueba no estaba en su edificio. Y no podría haber llevado las notas a través del pueblo y haber dejado una en un escritorio abarrotado a plena luz del día de festival, porque Theo Hussein no podía caminar por la avenida Evergreen desapercibido ni para salvar su vida.</w:t>
       </w:r>
     </w:p>
     <w:p/>
@@ -4160,13 +4160,13 @@
     <w:p/>
     <w:p>
       <w:r>
-        <w:t>Se resumía en lo siguiente. Yo sabía quién había sido. Sabía cómo lo habían hecho. Tenía las pruebas: la ficha del catálogo, el papel idéntico colocado junto a la lámpara, la escritura de propiedad de la posada fuera de su cajón. Así que podía ir a ver a Theo y a Vera en silencio, los tres a solas, sin nadie más enterado, y decirles: lo sé. Paren ahora mismo, y que esto acabe aquí, esta noche, sin que nadie más lo sepa. Jamás volverá a pasar. Y lo harían, porque eran personas aterradas y no criminales empedernidos. Llorarían de alivio al verse libres de la carga. Las notas pararían y Fiona estaría a salvo. El secreto volvería a su baúl en el desván. Theo conservaría su Sociedad y su buen nombre, y Vera, su empleo. El pueblo jamás tendría que enterarse de que dos de los suyos se habían torcido durante una sola mala estación. Todo el mundo al que quería se libraría de ese dolor.</w:t>
-      </w:r>
-    </w:p>
-    <w:p/>
-    <w:p>
-      <w:r>
-        <w:t>Nada de policía. Nada de escándalos. Ninguna columna desagradable en la Gazette. Ningún anciano entrañable sacado por la fuerza del edificio al que había entregado su vida. Tan solo unas palabras tranquilas en la oscuridad, clemencia, y cada cual a su casa a dormir.</w:t>
+        <w:t xml:space="preserve">Se resumía en lo siguiente. Yo sabía quién había sido. Sabía cómo lo habían hecho. Tenía las pruebas: la ficha del catálogo, el papel idéntico colocado junto a la lámpara, la escritura de propiedad de la posada fuera de su cajón. Así que podía ir a ver a Theo y a Vera en silencio, los tres a solas, sin nadie más enterado, y decirles: lo sé. Parad ahora mismo, y que esto acabe aquí, esta noche, sin que nadie más lo sepa. Jamás volverá a pasar. Y lo harían, porque eran personas aterradas y no criminales empedernidos. Llorarían de alivio al verse libres de la carga. Las notas pararían y Fiona estaría a salvo. El secreto volvería a su baúl en el desván. Theo conservaría su Sociedad y su buen nombre, y Vera, su empleo. El pueblo jamás tendría que enterarse de que dos de los suyos se habían torcido durante una sola mala estación. Todo el mundo al que quería se libraría de ese dolor.</w:t>
+      </w:r>
+    </w:p>
+    <w:p/>
+    <w:p>
+      <w:r>
+        <w:t xml:space="preserve">Nada de policía. Nada de escándalos. Ninguna columna desagradable en el Gazette. Ningún anciano entrañable sacado por la fuerza del edificio al que había entregado su vida. Tan solo unas palabras tranquilas en la oscuridad, clemencia, y cada cual a su casa a dormir.</w:t>
       </w:r>
     </w:p>
     <w:p/>
@@ -4184,7 +4184,7 @@
     <w:p/>
     <w:p>
       <w:r>
-        <w:t>Unas palabras tranquilas en la oscuridad protegerían a todas las personas excepto a aquella a la que más debían proteger. No liberaría a Fiona. Solo cambiaría de manos el secreto. En ese momento lo tenía un chantajista. Después de mi apacible clemencia, lo tendría yo. También Nick, y también Theo y Vera, perdonados y libres, las únicas dos personas en el mundo entero que sabían exactamente cómo convertir el baúl de un desván en una fortuna. Fiona pasaría el resto de su vida sabiendo que dos de sus vecinos habían intentado extorsionarla una vez, que se habían salido con la suya y que, cualquier noche mala, en cualquier invierno desesperado con los años, podrían volver a intentarlo. El miedo no terminaría. Solo se callaría. Yo había leído diez mil cartas en el Polo, y el dolor que contenían era muy a menudo un secreto llevado en soledad en la oscuridad.</w:t>
+        <w:t xml:space="preserve">Unas palabras tranquilas en la oscuridad protegerían a todas las personas excepto a aquella a la que más debían proteger. No liberaría a Fiona. Solo cambiaría de manos el secreto. En ese momento lo tenía un chantajista. Después de mi apacible clemencia, lo tendría yo. También Nick, y también Theo y Vera, perdonados y libres, las únicas dos personas en el mundo entero que sabían exactamente cómo convertir el baúl de un desván en una fortuna. Fiona pasaría el resto de su vida sabiendo que dos de sus vecinos habían intentado extorsionarla una vez, que se habían salido con la suya y que, cualquier noche mala, en cualquier invierno desesperado a lo largo de los años, podrían volver a intentarlo. El miedo no terminaría. Solo se callaría. Yo había leído diez mil cartas en el Polo, y el dolor que contenían era muy a menudo un secreto llevado en soledad en la oscuridad.</w:t>
       </w:r>
     </w:p>
     <w:p/>
@@ -4226,13 +4226,13 @@
     <w:p/>
     <w:p>
       <w:r>
-        <w:t>Ahí estaba, el último miedo, el más pequeño de todos y el más absolutamente mío. Yo seguía siendo medio extranjera en ese pueblo. Todos los demás se conocían desde que eran niños y aprendían a caminar por esas mismas aceras, y yo me había ido ganando mi sitio centímetro a centímetro, con una cazuela por aquí, una búsqueda de perros por allá, una silla arrastrada en el círculo de punto. Sacar a Theo Hussein a la luz podría costarme parte de ese terreno tan difícilmente ganado. A la gente no siempre le cae bien el que trae una verdad incómoda. Podía hacer exactamente lo correcto y convertirme, de ahí en adelante, en la intrusa que arruinó a un hombre bueno y llenó de dolor al pueblo.</w:t>
-      </w:r>
-    </w:p>
-    <w:p/>
-    <w:p>
-      <w:r>
-        <w:t>Me quedé allí con ese miedo y dejé que fuera real. Luego lo dejé marchar, porque Martha ya le había dado respuesta en el círculo, con la mano sobre mi rodilla. LLeves lo que lleves a cuestas, no tienes por qué cargarlo tú sola. De eso trata exactamente el círculo. Podía querer a un lugar lo suficiente como para hacer lo correcto y más difícil por él, y confiar en que seguiría siendo mío al otro lado.</w:t>
+        <w:t xml:space="preserve">Ahí estaba, el último miedo, el más pequeño de todos y el más absolutamente mío. Yo seguía siendo medio forastera en ese pueblo. Todos los demás se conocían desde que eran niños y aprendían a caminar por esas mismas aceras, y yo me había ido ganando mi sitio centímetro a centímetro, con una cazuela por aquí, la búsqueda de un perro por allá, una silla arrastrada en el círculo de punto. Sacar a Theo Hussein a la luz podría costarme parte de ese terreno tan difícilmente ganado. A la gente no siempre le cae bien el que trae una verdad incómoda. Podía hacer exactamente lo correcto y convertirme, de ahí en adelante, en la intrusa que arruinó a un hombre bueno y llenó de dolor al pueblo.</w:t>
+      </w:r>
+    </w:p>
+    <w:p/>
+    <w:p>
+      <w:r>
+        <w:t xml:space="preserve">Me quedé allí con ese miedo y dejé que fuera real. Luego lo dejé marchar, porque Martha ya le había dado respuesta en el círculo, con la mano sobre mi rodilla. Lleves lo que lleves a cuestas, no tienes por qué cargarlo tú sola. De eso trata exactamente el círculo. Podía querer a un lugar lo suficiente como para hacer lo correcto y más difícil por él, y confiar en que seguiría siendo mío al otro lado.</w:t>
       </w:r>
     </w:p>
     <w:p/>
@@ -4285,7 +4285,7 @@
     <w:p/>
     <w:p>
       <w:r>
-        <w:t>No me interrumpió ni una sola vez. Cuando terminé, guardó silencio un momento, haciendo girar lentamente su bolígrafo medio turno sobre la página abierta.</w:t>
+        <w:t xml:space="preserve">No me interrumpió ni una sola vez. Cuando terminé, guardó silencio un momento, haciendo girar lentamente su bolígrafo media vuelta sobre la página abierta.</w:t>
       </w:r>
     </w:p>
     <w:p/>
@@ -4321,7 +4321,7 @@
     <w:p/>
     <w:p>
       <w:r>
-        <w:t>—Entonces, así es como lo haremos. —Cerró la libreta—. Nada de redadas. Sin dinero marcado, ni sobres señuelo metidos bajo los escalones de la posada en la oscuridad. Eso es de película. Pone a la gente corriente en peligro sin ninguna buena razón. Nos sentaremos con ellos. Tú, yo y Fiona, si está dispuesta a estar ahí. Expondremos lo que sabemos, claramente, de la misma manera que me lo acabas de exponer a mí, y les daremos la oportunidad de ser las personas que este pueblo siempre ha creído que son. La mayoría de la gente, ante la verdad presentada de forma amable e íntegra, aprovecha esa oportunidad. Están cansados de cargar con ello. Muchos se alegran a medias, por debajo del miedo, de soltar el fardo.</w:t>
+        <w:t xml:space="preserve">—Entonces, así es como lo haremos. —Cerró la libreta—. Nada de operaciones encubiertas. Sin dinero marcado, ni sobres señuelo metidos bajo los escalones de la posada en la oscuridad. Eso es de película. Pone a la gente corriente en peligro sin ninguna buena razón. Nos sentaremos con ellos. Tú, yo y Fiona, si está dispuesta a estar ahí. Expondremos lo que sabemos, claramente, de la misma manera que me lo acabas de exponer a mí, y les daremos la oportunidad de ser las personas que este pueblo siempre ha creído que son. La mayoría de la gente, ante la verdad presentada de forma amable e íntegra, aprovecha esa oportunidad. Están cansados de cargar con ello. Muchos se alegran a medias, por debajo del miedo, de soltar el fardo.</w:t>
       </w:r>
     </w:p>
     <w:p/>
@@ -4351,7 +4351,7 @@
     <w:p/>
     <w:p>
       <w:r>
-        <w:t>—Has tenido miedo del secreto equivocado todo este tiempo —le dije—. Creías que el secreto era que Constance era una ladrona. Lee esto, Fiona. Los Blackburn llevaban meses sin pagarle. Su madre se estaba muriendo a tres calles de distancia sin dinero para un médico. Le dijeron a una chica que debía estar agradecida por tener un techo mientras una fortuna reposaba en una caja a la que quitaba el polvo todos los días. Ella no robó a personas que la habían tratado bien. Le quitó a quienes la habían robado primero, y construyó cien años de acogida sincera sobre esa base. —Le cerré las manos alrededor de la carpeta—. Eso no es un secreto que te arruine. Esa es una historia en la que puedes erguirte con la cabeza bien alta. El chantaje solo funcionó porque te has pasado la vida ocultando la mitad que te avergüenza, sin saber nunca que había otra mitad que no lo hace.</w:t>
+        <w:t xml:space="preserve">—Has tenido miedo del secreto equivocado todo este tiempo —le dije—. Creías que el secreto era que Constance era una ladrona. Lee esto, Fiona. Los Blackburn llevaban meses sin pagarle. Su madre se estaba muriendo a tres calles de distancia sin dinero para un médico. Le dijeron a una chica que debía estar agradecida por tener un techo mientras una fortuna reposaba en una caja a la que quitaba el polvo todos los días. Ella no robó a personas que la habían tratado bien. Se lo quitó a quienes le habían robado primero, y construyó cien años de acogida sincera sobre esa base. —Le cerré las manos alrededor de la carpeta—. Eso no es un secreto que te arruine. Esa es una historia en la que puedes erguirte con la cabeza bien alta. El chantaje solo funcionó porque te has pasado la vida ocultando la mitad que te avergüenza, sin saber nunca que había otra mitad que no lo hace.</w:t>
       </w:r>
     </w:p>
     <w:p/>
@@ -4446,7 +4446,7 @@
     </w:p>
     <w:p>
       <w:r>
-        <w:t>—Theo —dije—. Las notas de chantaje a Fiona fueron escritas en el papel con membrete de la Sociedad. El cartulina gruesa de tono crema con verjura. Lo comparé fibra por fibra con una hoja de tus existencias.</w:t>
+        <w:t xml:space="preserve">—Theo —dije—. Las notas de chantaje a Fiona fueron escritas en el papel con membrete de la Sociedad. La cartulina gruesa de tono crema con verjura. Lo comparé fibra por fibra con una hoja de tus existencias.</w:t>
       </w:r>
     </w:p>
     <w:p>
@@ -4468,7 +4468,7 @@
         <w:t>&lt;/bt&gt;</w:t>
       </w:r>
       <w:r>
-        <w:t>. Esas son tus palabras, Theo. Están en tu tarjeta de catálogo, de tu propia mano, la tarjeta de las cartas de los Blackburn que le dijiste a todo el pueblo en la inauguración que habían desaparecido. Las cartas no desaparecieron. Las apartaste porque contenían el secreto, y luego dijiste que se habían perdido para que a nadie se le ocurriera preguntar qué había en ellas.</w:t>
+        <w:t xml:space="preserve">. Esas son tus palabras, Theo. Están en tu ficha de catálogo, de tu propia mano, la ficha de las cartas de los Blackburn que le dijiste a todo el pueblo en la inauguración que habían desaparecido. Las cartas no desaparecieron. Las apartaste porque contenían el secreto, y luego dijiste que se habían perdido para que a nadie se le ocurriera preguntar qué había en ellas.</w:t>
       </w:r>
     </w:p>
     <w:p>
@@ -4533,7 +4533,7 @@
     </w:p>
     <w:p>
       <w:r>
-        <w:t>—Vera —dije—. Theo cometió el robo. Pero las notas sabían que la posada se había comprado con el dinero del broche, y eso jamás estuvo en ninguna carta de los Blackburn. Eso es un registro de propiedad. Una escritura. Y la escritura de esta posada estaba fuera de su cajón en tu cesta de rearchivar ayer por la mañana, manipulada, sobre el escritorio de una mujer que me había dicho dos veces que jamás lee los archivos que tiene a sus espaldas.</w:t>
+        <w:t xml:space="preserve">—Vera —dije—. Theo tenía la parte del robo. Pero las notas sabían que la posada se había comprado con el dinero del broche, y eso jamás estuvo en ninguna carta de los Blackburn. Eso es un registro de propiedad. Una escritura. Y la escritura de esta posada estaba fuera de su cajón en tu cesta de rearchivar ayer por la mañana, manipulada, sobre el escritorio de una mujer que me había dicho dos veces que jamás lee los archivos que tiene a sus espaldas.</w:t>
       </w:r>
     </w:p>
     <w:p>
@@ -4543,7 +4543,7 @@
     </w:p>
     <w:p>
       <w:r>
-        <w:t>—Él cometió el robo. Tú tenías la escritura. Y tú tenías las piernas, Vera. Él no podía cruzar este pueblo sin llamar la atención ni aunque le fuera la vida en ello; todo el mundo conoce a Theo, todo el mundo lo detiene. Pero a nadie le extraña que la secretaria del alcalde se pase por la posada durante el festival. Me crucé contigo en los escalones yo misma esa mañana, con tus pases de aparcamiento. Él no podría haberlo hecho solo. Necesitaba a alguien que pudiera moverse por el pueblo sin ser visto. Esa fuiste tú.</w:t>
+        <w:t xml:space="preserve">—Él tenía la parte del robo. Tú tenías la escritura. Y tú tenías las piernas, Vera. Él no podía cruzar este pueblo sin llamar la atención ni aunque le fuera la vida en ello; todo el mundo conoce a Theo, todo el mundo lo detiene. Pero a nadie le extraña que la secretaria del alcalde se pase por la posada durante el festival. Me crucé contigo en los escalones yo misma esa mañana, con tus pases de aparcamiento. Él no podría haberlo hecho solo. Necesitaba a alguien que pudiera moverse por el pueblo sin ser visto. Esa fuiste tú.</w:t>
       </w:r>
     </w:p>
     <w:p>
@@ -4553,7 +4553,7 @@
     </w:p>
     <w:p>
       <w:r>
-        <w:t>—Vino a verme —dijo—. Hace semanas. Casi fuera de sí con el tema, hablando de la Sociedad, de cómo había encontrado esto y no podía hacerlo solo. Y yo debí haber dicho que no. Sé que debí haber decir que no, ya lo sabía entonces.</w:t>
+        <w:t xml:space="preserve">—Vino a verme —dijo—. Hace semanas. Casi fuera de sí con el tema, hablando de la Sociedad, de cómo había encontrado esto y no podía hacerlo solo. Y yo debí haber dicho que no. Sé que debí haber dicho que no, ya lo sabía entonces.</w:t>
       </w:r>
     </w:p>
     <w:p>
@@ -4573,7 +4573,7 @@
     </w:p>
     <w:p>
       <w:r>
-        <w:t>—Jamás pensé en ti como persona. Eso es lo peor de todo, eso con lo que tendré que cargar. Solo pensé en el dinero y en poder dormir. Lo siento. Lo siento muchísimo, Fiona.</w:t>
+        <w:t xml:space="preserve">—Jamás pensé en ti como persona. Eso es lo peor de todo, eso con lo que tendré que cargar. Solo pensé en el dinero y en las noches sin dormir. Lo siento. Lo siento muchísimo, Fiona.</w:t>
       </w:r>
     </w:p>
     <w:p>
@@ -4623,7 +4623,7 @@
     <w:p/>
     <w:p>
       <w:r>
-        <w:t>Pip, bajo mi silla, había encontrado un sobre de azúcar en el suelo y lo daba vuelta con gran seriedad, por si acaso resultaba ser un pez.</w:t>
+        <w:t xml:space="preserve">Pip, bajo mi silla, había encontrado un sobre de azúcar en el suelo y le daba vueltas con gran seriedad, por si acaso resultaba ser un pez.</w:t>
       </w:r>
     </w:p>
     <w:p/>
@@ -4641,7 +4641,7 @@
     <w:p/>
     <w:p>
       <w:r>
-        <w:t>Renunció. No por una temporada, para volver a deslizarse discretamente en el sillón una vez que el pueblo se hubiera cansado de estar enfadado. Dimitió como director de la Sociedad Histórica de Frost Falls, y la junta, una vez que lo supo todo, aceptó la dimisión y hablaba en serio. Un hombre no podía extorsionar a un vecino usando la colección y el membrete de la Sociedad, y luego conservar las llaves del lugar.</w:t>
+        <w:t xml:space="preserve">Renunció. No por una temporada, para volver a deslizarse discretamente en el sillón una vez que el pueblo se hubiera cansado de estar enfadado. Dimitió como director de la Sociedad Histórica de Frost Falls, y la junta, una vez que lo supo todo, aceptó la dimisión, y en serio. Un hombre no podía extorsionar a un vecino usando la colección y el membrete de la Sociedad, y luego conservar las llaves del lugar.</w:t>
       </w:r>
     </w:p>
     <w:p/>
@@ -4695,13 +4695,13 @@
     <w:p/>
     <w:p>
       <w:r>
-        <w:t>Debería haber sido el final. Pero aún quedaba el asunto de la Sociedad en sí, aquello mismo que Theo había arruinado intentando salvar. Ya no formaba parte de ella. El techo seguía dejando entrar la lluvia y la caldera seguía muriendo, y nada en todo aquel recuento había aportado ni un solo dólar para ninguna de las dos cosas.</w:t>
-      </w:r>
-    </w:p>
-    <w:p/>
-    <w:p>
-      <w:r>
-        <w:t>Lo que había hecho mal para salvar seguía hundiéndose. Y ahora, con él fuera, había que salvarlo como Dios mandaba, por el pueblo, por sí mismo. O no se salvaría en absoluto.</w:t>
+        <w:t xml:space="preserve">Debería haber sido el final. Pero aún quedaba el asunto de la Sociedad en sí, aquello mismo por cuya salvación Theo se había arruinado. Ya no formaba parte de ella. El techo seguía dejando entrar la lluvia y la caldera seguía muriendo, y nada en todo aquel recuento había aportado ni un solo dólar para ninguna de las dos cosas.</w:t>
+      </w:r>
+    </w:p>
+    <w:p/>
+    <w:p>
+      <w:r>
+        <w:t xml:space="preserve">Aquello que había querido salvar obrando mal seguía hundiéndose. Y ahora, con él fuera, había que salvarlo como Dios mandaba, por el pueblo, por sí mismo. O no se salvaría en absoluto.</w:t>
       </w:r>
     </w:p>
     <w:p>
@@ -4717,7 +4717,7 @@
     </w:p>
     <w:p>
       <w:r>
-        <w:t>Se habían enterado, por supuesto. Nada de eso se quedaba callado en Frost Falls durante más de una mañana. Los refinados y amables Worthington habían deducido, entre los murmullos del festival y el silencio de la posada, que la Sociedad Histórica estaba en graves apuros y que esos apuros habían llevado a un buen hombre a un mal lugar. El señor Worthington me encontró en el porche de la posada en su última mañana, con su esposa al lado vistiendo su cachemira de color crema y su buen abrigo sobre el brazo, y fue directo al grano con la soltura de un hombre para quien el dinero nunca había sido un tema difícil de sacar.</w:t>
+        <w:t xml:space="preserve">Se habían enterado, por supuesto. Nada parecido se quedaba callado en Frost Falls durante más de una mañana. Los refinados y amables Worthington habían deducido, entre los murmullos del festival y el silencio de la posada, que la Sociedad Histórica estaba en graves apuros y que esos apuros habían llevado a un buen hombre a un mal lugar. El señor Worthington me encontró en el porche de la posada en su última mañana, con su esposa al lado vistiendo su cachemira de color crema y su buen abrigo sobre el brazo, y fue directo al grano con la soltura de un hombre para quien el dinero nunca había sido un tema difícil de sacar.</w:t>
       </w:r>
     </w:p>
     <w:p>
@@ -4752,7 +4752,7 @@
     </w:p>
     <w:p>
       <w:r>
-        <w:t>—A este pueblo le acaba de pasar algo feo —dije—, porque un buen hombre decidió que salvar a la Sociedad lo justificaba todo, que un rescate valía más que una mala acción, que el fin de aquello perdonaría los medios. Ahora bien. Si la Sociedad se salva la semana que viene con la chequera de un desconocido de paso, por muy amable que sea, la lección que el pueblo entero aprende en silencio es que Theo tenía razón en lo fundamental, al menos. Que la supervivencia del edificio es algo que llega de fuera, por dinero, por un atajo, por un benefactor, y no algo que el propio pueblo tenga que desear, por lo que deba luchar y lo que deba ganar. —Negué con la cabeza—. Una Sociedad salvada por un invitado generoso solo está aplazada, señor Worthington. Estará en el mismo pozo dentro de cinco años, esperando a que el siguiente visitante rico le coja cariño a las colchas. La única manera de que el lugar esté verdaderamente a salvo es que Frost Falls decida por sí mismo que vale la pena salvarlo, y lo salve, con sus propias manos, sacando de sus bolsillos, por muy vacíos que estén. Eso es más lento. Es mucho más difícil. Pero es la versión que perdura, y eso cura lo que acaba de pasar aquí en vez de ponerle un póster alegre por encima.</w:t>
+        <w:t xml:space="preserve">—A este pueblo le acaba de pasar algo feo —dije—, porque un buen hombre decidió que salvar a la Sociedad lo justificaba todo, que un rescate bien valía una mala acción, que el fin de aquello perdonaría los medios. Ahora bien. Si la Sociedad se salva la semana que viene con la chequera de un desconocido de paso, por muy amable que sea, la lección que el pueblo entero aprende en silencio es que Theo tenía razón en lo fundamental, al menos. Que la supervivencia del edificio es algo que llega de fuera, por dinero, por un atajo, por un benefactor, y no algo que el propio pueblo tenga que desear, por lo que deba luchar y lo que deba ganar. —Negué con la cabeza—. Una Sociedad salvada por un huésped generoso solo está aplazada, señor Worthington. Estará en el mismo pozo dentro de cinco años, esperando a que el siguiente visitante rico le coja cariño a las colchas. La única manera de que el lugar esté verdaderamente a salvo es que Frost Falls decida por sí mismo que vale la pena salvarlo, y lo salve, con sus propias manos, sacando de sus bolsillos, por muy vacíos que estén. Eso es más lento. Es mucho más difícil. Pero es la versión que perdura, y eso cura lo que acaba de pasar aquí en vez de ponerle un póster alegre por encima.</w:t>
       </w:r>
     </w:p>
     <w:p>
@@ -4787,7 +4787,7 @@
     </w:p>
     <w:p>
       <w:r>
-        <w:t>No me pareció una victoria mientras caminaba hacia casa. Acababa de convencer a un hombre amable de que no solucionara el único problema concreto que estaba en la raíz de todo el triste asunto, y hubo unos cuantos tramos fríos en ese paseo en los que me preguntué si había sido sabia o solo terca, si había dejado pasar un bien real por el bien de un principio que no iba a evitar que ni una sola gota de lluvia cayera en la trastienda.</w:t>
+        <w:t xml:space="preserve">No me pareció una victoria mientras caminaba hacia casa. Acababa de convencer a un hombre amable de que no solucionara el único problema concreto que estaba en la raíz de todo el triste asunto, y hubo unos cuantos tramos fríos en ese paseo en los que me pregunté si había sido sabia o solo terca, si había dejado pasar un bien real por el bien de un principio que no iba a evitar que ni una sola gota de lluvia cayera en la trastienda.</w:t>
       </w:r>
     </w:p>
     <w:p>
@@ -4797,12 +4797,12 @@
     </w:p>
     <w:p>
       <w:r>
-        <w:t>El juicio había terminado. La sanación de la gente que formaba parte de él había comenzado. Pero la Sociedad todavía pendía de un hilo, y íbamos a descubrir de qué estaba hecho Frost Falls cuando la situación importara de verdad.</w:t>
-      </w:r>
-    </w:p>
-    <w:p>
-      <w:r>
-        <w:t>Para cuando llegué a nuestro callejón, descubrí que confiaba en que el pueblo saldría adelante. Lo había visto movilizarse para buscar a un perro perdido. Había escuchado del propio Mark cómo la gente seguía apareciendo para ayudar a los Redfern con guisos, semana tras semana, en lo peor de todo aquello. Las personas capaces de hacer esas cosas podían salvar un edificio.</w:t>
+        <w:t xml:space="preserve">La rendición de cuentas había terminado. La sanación de la gente que formaba parte de él había comenzado. Pero la Sociedad todavía pendía de un hilo, y íbamos a descubrir de qué estaba hecho Frost Falls cuando la situación importara de verdad.</w:t>
+      </w:r>
+    </w:p>
+    <w:p>
+      <w:r>
+        <w:t xml:space="preserve">Para cuando llegué a nuestra calle, descubrí que confiaba en que el pueblo saldría adelante. Lo había visto movilizarse para buscar a un perro perdido. Había escuchado del propio Mark cómo la gente seguía apareciendo para ayudar a los Redfern con guisos, semana tras semana, en lo peor de todo aquello. Las personas capaces de hacer esas cosas podían salvar un edificio.</w:t>
       </w:r>
     </w:p>
     <w:p>
@@ -4838,7 +4838,7 @@
     </w:p>
     <w:p>
       <w:r>
-        <w:t>Y Fiona lo hizo. Dejó que Claire lo escribiera para el Gazette, la versión verídica y completa, con los documentos de Neil de por medio. No la versión de cotilleo con su villano limpio y su crimen limpio, sino la de verdad. Constance Okafor, una criada de diecinueve años en el invierno de 1924, a la que llevaban meses sin pagar, con su madre muriéndose tres calles más allá sin dinero para un médico, a la que le decían que estuviera agradecida por tener un techo mientras sacudía el polvo, todos los días, de un broche que valía más de lo que ganaría en tres vidas. Una muchacha desesperada que cogió lo único que tenía a mano, de una familia que la había robado primero, y lo convirtió en cien años de bienvenida sincera para los viajeros que pasaban por Frost Falls en pleno frío.</w:t>
+        <w:t xml:space="preserve">Y Fiona lo hizo. Dejó que Claire lo escribiera para el Gazette, la versión verídica y completa, con los documentos de Neil de por medio. No la versión de cotilleo con su villano limpio y su crimen limpio, sino la de verdad. Constance Okafor, una criada de diecinueve años en el invierno de 1924, a la que llevaban meses sin pagar, con su madre muriéndose tres calles más allá sin dinero para un médico, a la que le decían que estuviera agradecida por tener un techo mientras sacudía el polvo, todos los días, de un broche que valía más de lo que ganaría en tres vidas. Una muchacha desesperada que cogió lo único que tenía a mano, de una familia que le había robado primero, y lo convirtió en cien años de bienvenida sincera para los viajeros que pasaban por Frost Falls en pleno frío.</w:t>
       </w:r>
     </w:p>
     <w:p>
@@ -4848,7 +4848,7 @@
     </w:p>
     <w:p>
       <w:r>
-        <w:t>Martha dijo lo más sensato al respecto, en la tertulia, con las agujas en marcha todo el tiempo y los ojos fijos en su labor.</w:t>
+        <w:t xml:space="preserve">Martha dijo lo más sensato al respecto, en el círculo, con las agujas en marcha todo el tiempo y los ojos fijos en su labor.</w:t>
       </w:r>
     </w:p>
     <w:p>
@@ -4858,7 +4858,7 @@
     </w:p>
     <w:p>
       <w:r>
-        <w:t>Ese fue el final del poder del secreto, ahí mismo, en una tienda de lana, con la manzanilla infusionándose y los mitones terminados amontonándose en la cesta. Algo contado por entero, en una habitación cálida, entre gente que había conocido sus propios inviernos duros.</w:t>
+        <w:t xml:space="preserve">Ese fue el final del poder del secreto, ahí mismo, en una tienda de lana, con la manzanilla infusionándose y las manoplas terminadas amontonándose en la cesta. Algo contado por entero, en una habitación cálida, entre gente que había conocido sus propios inviernos duros.</w:t>
       </w:r>
     </w:p>
     <w:p>
@@ -4883,12 +4883,12 @@
     </w:p>
     <w:p>
       <w:r>
-        <w:t>Sam Patel me levantó el sombrero cruzando de un lado a otro de la avenida Evergreen. Hasta Noriko, que era escasa con los elogios, me comentó tomando un café que había manejado el asunto mejor que la mayoría de los profesionales con los que había trabajado en su carrera, que había encontrado una salida cálida para algo que casi siempre solo ofrece salidas frías.</w:t>
-      </w:r>
-    </w:p>
-    <w:p>
-      <w:r>
-        <w:t>Y Martha. Martha me cogió de la mano en la tertulia una tarde gris, me la sostuvo y dijo:</w:t>
+        <w:t xml:space="preserve">Sam Patel me saludó tocándose la gorra desde la otra acera de la avenida Evergreen. Hasta Noriko, que era escasa con los elogios, me comentó tomando un café que había manejado el asunto mejor que la mayoría de los profesionales con los que había trabajado en su carrera, que había encontrado una salida cálida para algo que casi siempre solo ofrece salidas frías.</w:t>
+      </w:r>
+    </w:p>
+    <w:p>
+      <w:r>
+        <w:t xml:space="preserve">Y Martha. Martha me cogió de la mano en el círculo una tarde gris, me la sostuvo y dijo:</w:t>
       </w:r>
     </w:p>
     <w:p>
@@ -4908,17 +4908,17 @@
     </w:p>
     <w:p>
       <w:r>
-        <w:t>Y me dio una palmada en la mano y volvió directa a su mitón, como si no acabara de desmoronarme por completo allí mismo.</w:t>
-      </w:r>
-    </w:p>
-    <w:p>
-      <w:r>
-        <w:t>Yo había bajado de la cima del mundo siendo casi una extranjera, buscando cada fría mañana un abrigo que aún no se había ablandado. Y en algún momento del peor asunto que había visto en Frost Falls, al hacer lo correcto aunque costara, el abrigo se había amoldado. Nadie se había sentado a decidirlo. Había querido al lugar lo suficiente como para hacer lo difícil y correcto por él. La gente de aquí me había visto hacerlo y había decidido, a su ritmo lento y de soslayo, que yo era de los suyos.</w:t>
-      </w:r>
-    </w:p>
-    <w:p>
-      <w:r>
-        <w:t>Caminé a casa aquella tarde a través de un pueblo que se sentía enteramente e indiscutiblemente mío. El festival ya se había desmontado y marchado, pero las luces a lo largo de la avenida Evergreen, casi todas doradas ya, seguían ardiendo con firmeza contra la oscuridad temprana. Pip iba waddleándose delante de mí de un charco de luz dorada a otro, deteniéndose en cada uno como si pudiera haber algo brillante en el fondo.</w:t>
+        <w:t xml:space="preserve">Y me dio una palmada en la mano y volvió directa a su manopla, como si no acabara de desmoronarme por completo allí mismo.</w:t>
+      </w:r>
+    </w:p>
+    <w:p>
+      <w:r>
+        <w:t xml:space="preserve">Yo había bajado de la cima del mundo siendo casi una forastera, buscando cada fría mañana un abrigo que aún no se había ablandado. Y en algún momento del peor asunto que había visto en Frost Falls, al hacer lo correcto aunque costara, el abrigo se había amoldado. Nadie se había sentado a decidirlo. Había querido al lugar lo suficiente como para hacer lo difícil y correcto por él. La gente de aquí me había visto hacerlo y había decidido, a su ritmo lento y de soslayo, que yo era de los suyos.</w:t>
+      </w:r>
+    </w:p>
+    <w:p>
+      <w:r>
+        <w:t xml:space="preserve">Caminé a casa aquella tarde a través de un pueblo que se sentía enteramente e indiscutiblemente mío. El festival ya se había desmontado y marchado, pero las luces a lo largo de la avenida Evergreen, casi todas doradas ya, seguían ardiendo con firmeza contra la oscuridad temprana. Pip iba anadeando delante de mí de un charco de luz dorada a otro, deteniéndose en cada uno como si pudiera haber algo brillante en el fondo.</w:t>
       </w:r>
     </w:p>
     <w:p>
@@ -4929,7 +4929,7 @@
     <w:p/>
     <w:p>
       <w:r>
-        <w:t>La Sociedad necesitaba un buen repaso después de lo de Theo, así que el círculo y buena mitad de Evergreen Avenue se presentaron los días siguientes para poner el archivo en orden.</w:t>
+        <w:t xml:space="preserve">La Sociedad necesitaba un buen repaso después de lo de Theo, así que el círculo y buena mitad de la avenida Evergreen se presentaron los días siguientes para poner el archivo en orden.</w:t>
       </w:r>
     </w:p>
     <w:p/>
@@ -4995,7 +4995,7 @@
     <w:p/>
     <w:p>
       <w:r>
-        <w:t>—Al fin y al cabo, él encontró la mitad del rastro —continuó Noriko—, aunque fuera a buscarlo por el camino equivocado. Lleva treinta años dedicados a saber dónde están enterradas las cosas de este pueblo. Debería estar allí para ver cómo esta sale a la luz. Puede que sea lo único bueno de lo que le toque estar cerca de nuevo. Y estar cerca de algo bueno que no se puede atribuir a sí mismo quizá sea exactamente la medicina que necesita.</w:t>
+        <w:t xml:space="preserve">—Al fin y al cabo, él encontró la mitad del rastro —continuó Noriko—, aunque fuera a buscarlo por el camino equivocado. Lleva treinta años dedicados a saber dónde están enterradas las cosas de este pueblo. Debería estar allí para ver cómo esta sale a la luz. Puede que sea lo primero bueno de lo que vuelva a estar cerca. Y estar cerca de algo bueno que no se puede atribuir a sí mismo quizá sea exactamente la medicina que necesita.</w:t>
       </w:r>
     </w:p>
     <w:p/>
@@ -5019,7 +5019,7 @@
     <w:p/>
     <w:p>
       <w:r>
-        <w:t>Un momento después, Bram apareció corriendo a toda prisa por el prado estrujándose la gorra, y detrás de él, por supuesto, venía un reno. Danzarina esta vez, que se había vuelto a escapar del cercado y había seguido a las linternas hasta el pueblo. Se quedó en medio del prado con la escarcha brillando en sus astas, contemplando la caja de cobre desenterrada con un interés leve y sin prisas, mientras un centenar de lugareños miraban fijamente y una niña pequeña chillaba de pura alegría.</w:t>
+        <w:t xml:space="preserve">Un momento después, Bram apareció corriendo a toda prisa por el prado estrujándose la gorra, y detrás de él, por supuesto, venía un reno. Dancer esta vez, que se había vuelto a escapar del cercado y había seguido a las linternas hasta el pueblo. Se quedó en medio del prado con la escarcha brillando en sus astas, contemplando la caja de cobre desenterrada con un interés leve y sin prisas, mientras un centenar de lugareños miraban fijamente y una niña pequeña chillaba de pura alegría.</w:t>
       </w:r>
     </w:p>
     <w:p/>
@@ -5031,13 +5031,13 @@
     <w:p/>
     <w:p>
       <w:r>
-        <w:t>—Déjala que se quede —dije riendo, mientras Emma se separaba de su padre y corría a echar los brazos al cuello de Danzarina—. No hace ningún mal, Bram. Déjala que eche un vistazo.</w:t>
-      </w:r>
-    </w:p>
-    <w:p/>
-    <w:p>
-      <w:r>
-        <w:t>Me quedé allí de pie en el prado mirando todo aquello: el olmo y las luces doradas, la caja de cobre verde, el reno, la niña risueña y todo el pueblo reunido de cerca a la luz de las linternas. Pip había ido a plantarse bajo las narices de Danzarina y le estaba dedicando una mirada larga y severa, como para recordarle de quién era aquel pingüino. La mano de Nick encontró la mía. Más allá del cercado estaba el hogar que él había encendido para la magia, y me pregunté cuánta más estaría dando vueltas por allí para cuando volviéramos a casa.</w:t>
+        <w:t xml:space="preserve">—Déjala que se quede —dije riendo, mientras Emma se separaba de su padre y corría a echar los brazos al cuello de Dancer—. No hace ningún mal, Bram. Déjala que eche un vistazo.</w:t>
+      </w:r>
+    </w:p>
+    <w:p/>
+    <w:p>
+      <w:r>
+        <w:t xml:space="preserve">Me quedé allí de pie en el prado mirando todo aquello: el olmo y las luces doradas, la caja de cobre verde, el reno, la niña risueña y todo el pueblo reunido de cerca a la luz de las linternas. Pip había ido a plantarse bajo las narices de Dancer y le estaba dedicando una mirada larga y severa, como para recordarle de quién era aquel pingüino. La mano de Nick encontró la mía. Más allá del cercado estaba el hogar que él había construido para la magia, y me pregunté cuánta más estaría dando vueltas por allí para cuando volviéramos a casa.</w:t>
       </w:r>
     </w:p>
     <w:p/>
@@ -5186,7 +5186,7 @@
     <w:p/>
     <w:p>
       <w:r>
-        <w:t>—No merezco estar allí. Pero dice que puedo mirar. Después de todo, puedo estar de pie en la sala cuando el pueblo abra su corazón. Pienso en ello todos los días. Es una buena parte de lo que me mantiene en pie, si soy sincera.</w:t>
+        <w:t xml:space="preserve">—No merezco estar allí. Pero dice que puedo mirar. Después de todo, puedo estar de pie en la sala cuando el pueblo abra su corazón. Pienso en ello todos los días. Es una buena parte de lo que me mantiene en pie, si soy sincero.</w:t>
       </w:r>
     </w:p>
     <w:p/>
@@ -5285,7 +5285,7 @@
     <w:p/>
     <w:p>
       <w:r>
-        <w:t>¿Qué sigue?</w:t>
+        <w:t xml:space="preserve">¿Y ahora qué?</w:t>
       </w:r>
     </w:p>
     <w:p/>
@@ -5303,7 +5303,7 @@
     <w:p/>
     <w:p>
       <w:r>
-        <w:t>Entonces una piedra atraviesa el cristal y una palabra aparece escrita en rojo sobre el revestimiento de tablillas donde todos los niños de la avenida Evergreen la leerán al pasar.</w:t>
+        <w:t xml:space="preserve">Entonces un ladrillo atraviesa el cristal y una palabra aparece escrita en rojo sobre el revestimiento de tablillas donde todos los niños de la avenida Evergreen la leerán al pasar.</w:t>
       </w:r>
     </w:p>
     <w:p/>
@@ -5447,7 +5447,7 @@
     <w:p/>
     <w:p>
       <w:r>
-        <w:t xml:space="preserve">—Lleva tras tu truco desde el día en que entraste. Y tras el mío en el ochenta y pico. </w:t>
+        <w:t xml:space="preserve">—Lleva tras tu truco desde el día en que entraste. Y tras el mío allá por mil novecientos ochenta y tantos. </w:t>
       </w:r>
     </w:p>
     <w:p/>
@@ -5543,7 +5543,7 @@
     <w:p/>
     <w:p>
       <w:r>
-        <w:t>—Acaba de salirme del horno una bandeja de magdalenas de chocolate y nuez hace ni una hora y me he dicho: Greta, ¿quién estará sentada en una tienda fría haciéndose útil esta mañana?, y la respuesta era todas ustedes, así que toma.</w:t>
+        <w:t xml:space="preserve">—Acaba de salirme del horno una bandeja de magdalenas de chocolate y nuez hace ni una hora y me he dicho: Greta, ¿quién estará sentada en una tienda fría haciéndose útil esta mañana?, y la respuesta era todas vosotras, así que tomad.</w:t>
       </w:r>
     </w:p>
     <w:p/>
@@ -5555,7 +5555,7 @@
     <w:p/>
     <w:p>
       <w:r>
-        <w:t xml:space="preserve">—Alguien tiene que hacerlo. Ustedes solas no lo van a hacer. </w:t>
+        <w:t xml:space="preserve">—Alguien tiene que hacerlo. Vosotras solas no lo vais a hacer. </w:t>
       </w:r>
     </w:p>
     <w:p/>
@@ -5591,7 +5591,7 @@
     <w:p/>
     <w:p>
       <w:r>
-        <w:t>—¿Por qué están todas haciendo coronas? —preguntó, señalando con la cabeza nuestros armazones, con la boca llena.</w:t>
+        <w:t xml:space="preserve">—¿Por qué estáis todas haciendo coronas? —preguntó, señalando con la cabeza nuestros armazones, con la boca llena.</w:t>
       </w:r>
     </w:p>
     <w:p/>
@@ -5699,7 +5699,7 @@
     <w:p/>
     <w:p>
       <w:r>
-        <w:t>Ahora estaba de espaldas a la carretera, con los brazos de paleta extendidos a los lados, la tosca cara de carbón apuntando hacia el prado en dirección a los tiendas. Hacia, si uno quería ser exacto al respecto, el extremo lejano de la manzana donde el antiguo local de Fenwick aguardaba tras su papel marrón. Los otros dos seguían mirando a la calle. Solo el del medio se había movido. Girado sobre su base para mirar hacia otro lado. Y no había ni una sola huella cerca de él. La nieve alrededor de los tres yacía lisa e ininterrumpida. Quince centímetros de limpia caída nocturna, sin nada escrito en ella salvo las largas sombras azules de la barandilla del templete.</w:t>
+        <w:t xml:space="preserve">Ahora estaba de espaldas a la carretera, con los brazos de palo extendidos a los lados, la tosca cara de carbón apuntando hacia el prado en dirección a las tiendas. Hacia, si uno quería ser exacto al respecto, el extremo lejano de la manzana donde el antiguo local de Fenwick aguardaba tras su papel marrón. Los otros dos seguían mirando a la calle. Solo el del medio se había movido. Girado sobre su base para mirar hacia otro lado. Y no había ni una sola huella cerca de él. La nieve alrededor de los tres yacía lisa e ininterrumpida. Quince centímetros de limpia caída nocturna, sin nada escrito en ella salvo las largas sombras azules de la barandilla del templete.</w:t>
       </w:r>
     </w:p>
     <w:p/>
@@ -5747,13 +5747,13 @@
     <w:p/>
     <w:p>
       <w:r>
-        <w:t>Aparté la vista del muñeco de nieve girado y miré calle arriba hacia las ventanas empapeladas de marrón del antiguo local de Fenwick, exactamente hacia donde apuntaban sus brazos de paleta, y pensé que la magia, se dijera lo que se dijera de ella, siempre había tenido buen olfato para lo que importaba antes que yo.</w:t>
-      </w:r>
-    </w:p>
-    <w:p/>
-    <w:p>
-      <w:r>
-        <w:t>Pero no le dije nada de esto al círculo. Cogí una galleta de jengibre, le dije que no a Pip cuando miró las migas, y volví a sentarme a mi corona. Até el abeto, ramita sobre ramita, todas apuntando hacia el mismo lado. A mi espalda crepitaba un leño en la estufa y las mujeres charlaban. La nieve yacía brillante en el prado con un muñeco de nieve vuelto del revés. Algo estaba empezando. Confié en aquel fresco cosquilleo en la nuca, y me acompañó durante toda la mañana.</w:t>
+        <w:t xml:space="preserve">Aparté la vista del muñeco de nieve girado y miré calle arriba hacia las ventanas empapeladas de marrón del antiguo local de Fenwick, exactamente hacia donde apuntaban sus brazos de palo, y pensé que la magia, se dijera lo que se dijera de ella, siempre había tenido buen olfato para lo que importaba antes que yo.</w:t>
+      </w:r>
+    </w:p>
+    <w:p/>
+    <w:p>
+      <w:r>
+        <w:t xml:space="preserve">Pero no le dije nada de esto al círculo. Cogí una galleta de jengibre, le dije que no a Pip cuando miró las migas, y volví a sentarme a mi corona. Até el abeto, ramita sobre ramita, todas apuntando hacia el mismo lado. A mi espalda crepitaba un leño en la estufa y las mujeres charlaban. La nieve yacía brillante en el prado con un muñeco de nieve mirando hacia el lado equivocado. Algo estaba empezando. Confié en aquel fresco cosquilleo en la nuca, y me acompañó durante toda la mañana.</w:t>
       </w:r>
     </w:p>
     <w:p/>

</xml_diff>